<commit_message>
ChessMaze v09.13.1 - Continued development on evidence pack
</commit_message>
<xml_diff>
--- a/docs/EvidencePack.docx
+++ b/docs/EvidencePack.docx
@@ -141,7 +141,11 @@
           <w:tcPr>
             <w:tcW w:w="4508" w:type="dxa"/>
           </w:tcPr>
-          <w:p/>
+          <w:p>
+            <w:r>
+              <w:t>14 September 2026</w:t>
+            </w:r>
+          </w:p>
         </w:tc>
       </w:tr>
     </w:tbl>
@@ -253,8 +257,13 @@
             <w:tcW w:w="4343" w:type="dxa"/>
           </w:tcPr>
           <w:p>
-            <w:r>
-              <w:t>GamePlayer.cs line 36 - 69</w:t>
+            <w:proofErr w:type="spellStart"/>
+            <w:r>
+              <w:t>GamePlayer.cs</w:t>
+            </w:r>
+            <w:proofErr w:type="spellEnd"/>
+            <w:r>
+              <w:t xml:space="preserve"> line 36 - 69</w:t>
             </w:r>
           </w:p>
         </w:tc>
@@ -285,8 +294,13 @@
             <w:tcW w:w="4343" w:type="dxa"/>
           </w:tcPr>
           <w:p>
-            <w:r>
-              <w:t>GamePlayer.cs line 229 – 234</w:t>
+            <w:proofErr w:type="spellStart"/>
+            <w:r>
+              <w:t>GamePlayer.cs</w:t>
+            </w:r>
+            <w:proofErr w:type="spellEnd"/>
+            <w:r>
+              <w:t xml:space="preserve"> line 229 – 234</w:t>
             </w:r>
           </w:p>
         </w:tc>
@@ -317,8 +331,13 @@
             <w:tcW w:w="4343" w:type="dxa"/>
           </w:tcPr>
           <w:p>
-            <w:r>
-              <w:t>GamePlayer.cs line 101 - 127</w:t>
+            <w:proofErr w:type="spellStart"/>
+            <w:r>
+              <w:t>GamePlayer.cs</w:t>
+            </w:r>
+            <w:proofErr w:type="spellEnd"/>
+            <w:r>
+              <w:t xml:space="preserve"> line 101 - 127</w:t>
             </w:r>
           </w:p>
         </w:tc>
@@ -349,8 +368,13 @@
             <w:tcW w:w="4343" w:type="dxa"/>
           </w:tcPr>
           <w:p>
-            <w:r>
-              <w:t xml:space="preserve">GamePlayer.cs line 129 – 155 </w:t>
+            <w:proofErr w:type="spellStart"/>
+            <w:r>
+              <w:t>GamePlayer.cs</w:t>
+            </w:r>
+            <w:proofErr w:type="spellEnd"/>
+            <w:r>
+              <w:t xml:space="preserve"> line 129 – 155 </w:t>
             </w:r>
           </w:p>
         </w:tc>
@@ -381,8 +405,13 @@
             <w:tcW w:w="4343" w:type="dxa"/>
           </w:tcPr>
           <w:p>
-            <w:r>
-              <w:t>GamePlayer.cs line 158 – 171</w:t>
+            <w:proofErr w:type="spellStart"/>
+            <w:r>
+              <w:t>GamePlayer.cs</w:t>
+            </w:r>
+            <w:proofErr w:type="spellEnd"/>
+            <w:r>
+              <w:t xml:space="preserve"> line 158 – 171</w:t>
             </w:r>
           </w:p>
         </w:tc>
@@ -413,8 +442,13 @@
             <w:tcW w:w="4343" w:type="dxa"/>
           </w:tcPr>
           <w:p>
-            <w:r>
-              <w:t>GamePlayer.cs line 173 – 185</w:t>
+            <w:proofErr w:type="spellStart"/>
+            <w:r>
+              <w:t>GamePlayer.cs</w:t>
+            </w:r>
+            <w:proofErr w:type="spellEnd"/>
+            <w:r>
+              <w:t xml:space="preserve"> line 173 – 185</w:t>
             </w:r>
           </w:p>
         </w:tc>
@@ -445,8 +479,13 @@
             <w:tcW w:w="4343" w:type="dxa"/>
           </w:tcPr>
           <w:p>
-            <w:r>
-              <w:t xml:space="preserve">GamePlayer.cs line </w:t>
+            <w:proofErr w:type="spellStart"/>
+            <w:r>
+              <w:t>GamePlayer.cs</w:t>
+            </w:r>
+            <w:proofErr w:type="spellEnd"/>
+            <w:r>
+              <w:t xml:space="preserve"> line </w:t>
             </w:r>
             <w:r>
               <w:t>85 – 95 and 190-193</w:t>
@@ -480,8 +519,13 @@
             <w:tcW w:w="4343" w:type="dxa"/>
           </w:tcPr>
           <w:p>
-            <w:r>
-              <w:t>GamePlayer.cs line 206-224</w:t>
+            <w:proofErr w:type="spellStart"/>
+            <w:r>
+              <w:t>GamePlayer.cs</w:t>
+            </w:r>
+            <w:proofErr w:type="spellEnd"/>
+            <w:r>
+              <w:t xml:space="preserve"> line 206-224</w:t>
             </w:r>
           </w:p>
         </w:tc>
@@ -662,8 +706,13 @@
             <w:tcW w:w="1842" w:type="dxa"/>
           </w:tcPr>
           <w:p>
-            <w:r>
-              <w:t>GamePlayer.cs line 36 - 69</w:t>
+            <w:proofErr w:type="spellStart"/>
+            <w:r>
+              <w:t>GamePlayer.cs</w:t>
+            </w:r>
+            <w:proofErr w:type="spellEnd"/>
+            <w:r>
+              <w:t xml:space="preserve"> line 36 - 69</w:t>
             </w:r>
           </w:p>
         </w:tc>
@@ -672,8 +721,13 @@
             <w:tcW w:w="2784" w:type="dxa"/>
           </w:tcPr>
           <w:p>
-            <w:r>
-              <w:t>GamePlayerTests.cs line 11 - 49</w:t>
+            <w:proofErr w:type="spellStart"/>
+            <w:r>
+              <w:t>GamePlayerTests.cs</w:t>
+            </w:r>
+            <w:proofErr w:type="spellEnd"/>
+            <w:r>
+              <w:t xml:space="preserve"> line 11 - 49</w:t>
             </w:r>
           </w:p>
         </w:tc>
@@ -714,8 +768,13 @@
             <w:tcW w:w="1842" w:type="dxa"/>
           </w:tcPr>
           <w:p>
-            <w:r>
-              <w:t>GamePlayer.cs line 229 – 234</w:t>
+            <w:proofErr w:type="spellStart"/>
+            <w:r>
+              <w:t>GamePlayer.cs</w:t>
+            </w:r>
+            <w:proofErr w:type="spellEnd"/>
+            <w:r>
+              <w:t xml:space="preserve"> line 229 – 234</w:t>
             </w:r>
           </w:p>
         </w:tc>
@@ -724,9 +783,11 @@
             <w:tcW w:w="2784" w:type="dxa"/>
           </w:tcPr>
           <w:p>
+            <w:proofErr w:type="spellStart"/>
             <w:r>
               <w:t>GamePlayerTests.cs</w:t>
             </w:r>
+            <w:proofErr w:type="spellEnd"/>
           </w:p>
           <w:p>
             <w:r>
@@ -762,8 +823,56 @@
                 <w:sz w:val="22"/>
                 <w:szCs w:val="22"/>
               </w:rPr>
-              <w:t>Any invalid movements that apply to all pieces such as OutOfBounds, InvalidDestination or GameAlreadyCompleted</w:t>
-            </w:r>
+              <w:t>Block a</w:t>
+            </w:r>
+            <w:r>
+              <w:rPr>
+                <w:sz w:val="22"/>
+                <w:szCs w:val="22"/>
+              </w:rPr>
+              <w:t xml:space="preserve">ny invalid movements that apply to all pieces such as </w:t>
+            </w:r>
+            <w:proofErr w:type="spellStart"/>
+            <w:r>
+              <w:rPr>
+                <w:sz w:val="22"/>
+                <w:szCs w:val="22"/>
+              </w:rPr>
+              <w:t>OutOfBounds</w:t>
+            </w:r>
+            <w:proofErr w:type="spellEnd"/>
+            <w:r>
+              <w:rPr>
+                <w:sz w:val="22"/>
+                <w:szCs w:val="22"/>
+              </w:rPr>
+              <w:t xml:space="preserve">, </w:t>
+            </w:r>
+            <w:proofErr w:type="spellStart"/>
+            <w:r>
+              <w:rPr>
+                <w:sz w:val="22"/>
+                <w:szCs w:val="22"/>
+              </w:rPr>
+              <w:t>InvalidDestination</w:t>
+            </w:r>
+            <w:proofErr w:type="spellEnd"/>
+            <w:r>
+              <w:rPr>
+                <w:sz w:val="22"/>
+                <w:szCs w:val="22"/>
+              </w:rPr>
+              <w:t xml:space="preserve"> or </w:t>
+            </w:r>
+            <w:proofErr w:type="spellStart"/>
+            <w:r>
+              <w:rPr>
+                <w:sz w:val="22"/>
+                <w:szCs w:val="22"/>
+              </w:rPr>
+              <w:t>GameAlreadyCompleted</w:t>
+            </w:r>
+            <w:proofErr w:type="spellEnd"/>
           </w:p>
         </w:tc>
         <w:tc>
@@ -771,9 +880,11 @@
             <w:tcW w:w="1842" w:type="dxa"/>
           </w:tcPr>
           <w:p>
+            <w:proofErr w:type="spellStart"/>
             <w:r>
               <w:t>Gameplayer.cs</w:t>
             </w:r>
+            <w:proofErr w:type="spellEnd"/>
           </w:p>
           <w:p>
             <w:r>
@@ -791,9 +902,11 @@
             <w:tcW w:w="2784" w:type="dxa"/>
           </w:tcPr>
           <w:p>
+            <w:proofErr w:type="spellStart"/>
             <w:r>
               <w:t>TryMoveAllPiecesTests.cs</w:t>
             </w:r>
+            <w:proofErr w:type="spellEnd"/>
           </w:p>
           <w:p>
             <w:r>
@@ -829,20 +942,34 @@
                 <w:sz w:val="22"/>
                 <w:szCs w:val="22"/>
               </w:rPr>
-              <w:t xml:space="preserve">Any invalid movements that apply specifically to the rook pieces (destinations that are not vertically or horizontally aligned to the </w:t>
+              <w:t>Block a</w:t>
             </w:r>
             <w:r>
               <w:rPr>
                 <w:sz w:val="22"/>
                 <w:szCs w:val="22"/>
               </w:rPr>
-              <w:t>current</w:t>
+              <w:t xml:space="preserve">ny </w:t>
             </w:r>
             <w:r>
               <w:rPr>
                 <w:sz w:val="22"/>
                 <w:szCs w:val="22"/>
               </w:rPr>
+              <w:t xml:space="preserve">invalid movements that apply specifically to the rook pieces (destinations that are not vertically or horizontally aligned to the </w:t>
+            </w:r>
+            <w:r>
+              <w:rPr>
+                <w:sz w:val="22"/>
+                <w:szCs w:val="22"/>
+              </w:rPr>
+              <w:t>current</w:t>
+            </w:r>
+            <w:r>
+              <w:rPr>
+                <w:sz w:val="22"/>
+                <w:szCs w:val="22"/>
+              </w:rPr>
               <w:t xml:space="preserve"> position)</w:t>
             </w:r>
           </w:p>
@@ -852,9 +979,11 @@
             <w:tcW w:w="1842" w:type="dxa"/>
           </w:tcPr>
           <w:p>
+            <w:proofErr w:type="spellStart"/>
             <w:r>
               <w:t>GamePlayer.cs</w:t>
             </w:r>
+            <w:proofErr w:type="spellEnd"/>
           </w:p>
           <w:p>
             <w:r>
@@ -867,9 +996,11 @@
             <w:tcW w:w="2784" w:type="dxa"/>
           </w:tcPr>
           <w:p>
+            <w:proofErr w:type="spellStart"/>
             <w:r>
               <w:t>TryMoveRookTests.cs</w:t>
             </w:r>
+            <w:proofErr w:type="spellEnd"/>
           </w:p>
           <w:p>
             <w:r>
@@ -905,7 +1036,21 @@
                 <w:sz w:val="22"/>
                 <w:szCs w:val="22"/>
               </w:rPr>
-              <w:t>Any invalid movements specific for bishop piece (destinations that are not diagonally aligned to the current position)</w:t>
+              <w:t>Block a</w:t>
+            </w:r>
+            <w:r>
+              <w:rPr>
+                <w:sz w:val="22"/>
+                <w:szCs w:val="22"/>
+              </w:rPr>
+              <w:t xml:space="preserve">ny </w:t>
+            </w:r>
+            <w:r>
+              <w:rPr>
+                <w:sz w:val="22"/>
+                <w:szCs w:val="22"/>
+              </w:rPr>
+              <w:t>invalid movements specific for bishop piece (destinations that are not diagonally aligned to the current position)</w:t>
             </w:r>
           </w:p>
         </w:tc>
@@ -914,9 +1059,11 @@
             <w:tcW w:w="1842" w:type="dxa"/>
           </w:tcPr>
           <w:p>
+            <w:proofErr w:type="spellStart"/>
             <w:r>
               <w:t>GamePlayer.cs</w:t>
             </w:r>
+            <w:proofErr w:type="spellEnd"/>
           </w:p>
           <w:p>
             <w:r>
@@ -929,9 +1076,11 @@
             <w:tcW w:w="2784" w:type="dxa"/>
           </w:tcPr>
           <w:p>
+            <w:proofErr w:type="spellStart"/>
             <w:r>
               <w:t>TryMoveBishopTests.cs</w:t>
             </w:r>
+            <w:proofErr w:type="spellEnd"/>
           </w:p>
           <w:p>
             <w:r>
@@ -967,21 +1116,21 @@
                 <w:sz w:val="22"/>
                 <w:szCs w:val="22"/>
               </w:rPr>
-              <w:t xml:space="preserve">Any invalid movements specific for bishop piece (destinations that are not </w:t>
+              <w:t>Block a</w:t>
             </w:r>
             <w:r>
               <w:rPr>
                 <w:sz w:val="22"/>
                 <w:szCs w:val="22"/>
               </w:rPr>
-              <w:t>2 steps in one axis and 1 step on the other axis</w:t>
+              <w:t xml:space="preserve">ny </w:t>
             </w:r>
             <w:r>
               <w:rPr>
                 <w:sz w:val="22"/>
                 <w:szCs w:val="22"/>
               </w:rPr>
-              <w:t>)</w:t>
+              <w:t>invalid movements specific for bishop piece (destinations that are not 2 steps in one axis and 1 step on the other axis)</w:t>
             </w:r>
           </w:p>
         </w:tc>
@@ -990,9 +1139,11 @@
             <w:tcW w:w="1842" w:type="dxa"/>
           </w:tcPr>
           <w:p>
+            <w:proofErr w:type="spellStart"/>
             <w:r>
               <w:t>GamePlayer.cs</w:t>
             </w:r>
+            <w:proofErr w:type="spellEnd"/>
           </w:p>
           <w:p>
             <w:r>
@@ -1005,9 +1156,11 @@
             <w:tcW w:w="2784" w:type="dxa"/>
           </w:tcPr>
           <w:p>
+            <w:proofErr w:type="spellStart"/>
             <w:r>
               <w:t>TryMoveKnightTests.cs</w:t>
             </w:r>
+            <w:proofErr w:type="spellEnd"/>
           </w:p>
           <w:p>
             <w:r>
@@ -1049,7 +1202,21 @@
                 <w:sz w:val="22"/>
                 <w:szCs w:val="22"/>
               </w:rPr>
-              <w:t>Any invalid movements specific for King piece (destinations that are more than 1 step away from the current destination across any axis)</w:t>
+              <w:t>Block a</w:t>
+            </w:r>
+            <w:r>
+              <w:rPr>
+                <w:sz w:val="22"/>
+                <w:szCs w:val="22"/>
+              </w:rPr>
+              <w:t xml:space="preserve">ny </w:t>
+            </w:r>
+            <w:r>
+              <w:rPr>
+                <w:sz w:val="22"/>
+                <w:szCs w:val="22"/>
+              </w:rPr>
+              <w:t>invalid movements specific for King piece (destinations that are more than 1 step away from the current destination across any axis)</w:t>
             </w:r>
           </w:p>
         </w:tc>
@@ -1058,9 +1225,11 @@
             <w:tcW w:w="1842" w:type="dxa"/>
           </w:tcPr>
           <w:p>
+            <w:proofErr w:type="spellStart"/>
             <w:r>
               <w:t>GamePlayer.cs</w:t>
             </w:r>
+            <w:proofErr w:type="spellEnd"/>
           </w:p>
           <w:p>
             <w:r>
@@ -1073,9 +1242,11 @@
             <w:tcW w:w="2784" w:type="dxa"/>
           </w:tcPr>
           <w:p>
+            <w:proofErr w:type="spellStart"/>
             <w:r>
               <w:t>TryMoveKingTests.cs</w:t>
             </w:r>
+            <w:proofErr w:type="spellEnd"/>
           </w:p>
           <w:p>
             <w:r>
@@ -1097,7 +1268,13 @@
           </w:tcPr>
           <w:p>
             <w:r>
-              <w:t>Complete game functionality</w:t>
+              <w:t>Complete</w:t>
+            </w:r>
+            <w:r>
+              <w:t>d</w:t>
+            </w:r>
+            <w:r>
+              <w:t xml:space="preserve"> game functionality</w:t>
             </w:r>
           </w:p>
         </w:tc>
@@ -1126,9 +1303,11 @@
             <w:tcW w:w="1842" w:type="dxa"/>
           </w:tcPr>
           <w:p>
+            <w:proofErr w:type="spellStart"/>
             <w:r>
               <w:t>GamePlayer.cs</w:t>
             </w:r>
+            <w:proofErr w:type="spellEnd"/>
           </w:p>
           <w:p>
             <w:r>
@@ -1179,7 +1358,21 @@
                 <w:sz w:val="22"/>
                 <w:szCs w:val="22"/>
               </w:rPr>
-              <w:t>Stores all successful movements in the current game session into a list, this list is able to be cleared upon game reset</w:t>
+              <w:t xml:space="preserve">Stores all successful movements in the current game session into a list, this list </w:t>
+            </w:r>
+            <w:r>
+              <w:rPr>
+                <w:sz w:val="22"/>
+                <w:szCs w:val="22"/>
+              </w:rPr>
+              <w:t>can</w:t>
+            </w:r>
+            <w:r>
+              <w:rPr>
+                <w:sz w:val="22"/>
+                <w:szCs w:val="22"/>
+              </w:rPr>
+              <w:t xml:space="preserve"> be cleared upon game reset</w:t>
             </w:r>
           </w:p>
         </w:tc>
@@ -1188,9 +1381,11 @@
             <w:tcW w:w="1842" w:type="dxa"/>
           </w:tcPr>
           <w:p>
+            <w:proofErr w:type="spellStart"/>
             <w:r>
               <w:t>GamePlayer.cs</w:t>
             </w:r>
+            <w:proofErr w:type="spellEnd"/>
           </w:p>
           <w:p>
             <w:r>
@@ -1216,7 +1411,6 @@
         <w:pStyle w:val="Heading2"/>
       </w:pPr>
       <w:r>
-        <w:lastRenderedPageBreak/>
         <w:t>UML and responsibility boundaries</w:t>
       </w:r>
     </w:p>
@@ -1306,19 +1500,2045 @@
           <w:tcPr>
             <w:tcW w:w="3005" w:type="dxa"/>
           </w:tcPr>
+          <w:p>
+            <w:r>
+              <w:t>«interface»</w:t>
+            </w:r>
+          </w:p>
+          <w:p>
+            <w:proofErr w:type="spellStart"/>
+            <w:r>
+              <w:t>IGamePlayer</w:t>
+            </w:r>
+            <w:proofErr w:type="spellEnd"/>
+          </w:p>
+        </w:tc>
+        <w:tc>
+          <w:tcPr>
+            <w:tcW w:w="3005" w:type="dxa"/>
+          </w:tcPr>
+          <w:p>
+            <w:r>
+              <w:t>Defining</w:t>
+            </w:r>
+            <w:r>
+              <w:t xml:space="preserve"> the observable behaviour of a Game Player Model</w:t>
+            </w:r>
+          </w:p>
+        </w:tc>
+        <w:tc>
+          <w:tcPr>
+            <w:tcW w:w="3006" w:type="dxa"/>
+          </w:tcPr>
+          <w:p>
+            <w:r>
+              <w:t xml:space="preserve">Used by </w:t>
+            </w:r>
+            <w:proofErr w:type="spellStart"/>
+            <w:r>
+              <w:t>GamePlayer</w:t>
+            </w:r>
+            <w:proofErr w:type="spellEnd"/>
+            <w:r>
+              <w:t xml:space="preserve"> class</w:t>
+            </w:r>
+          </w:p>
+        </w:tc>
+      </w:tr>
+      <w:tr>
+        <w:tc>
+          <w:tcPr>
+            <w:tcW w:w="3005" w:type="dxa"/>
+          </w:tcPr>
+          <w:p>
+            <w:r>
+              <w:t>«</w:t>
+            </w:r>
+            <w:r>
+              <w:t>class</w:t>
+            </w:r>
+            <w:r>
+              <w:t>»</w:t>
+            </w:r>
+          </w:p>
+          <w:p>
+            <w:proofErr w:type="spellStart"/>
+            <w:r>
+              <w:t>GamePlayer</w:t>
+            </w:r>
+            <w:proofErr w:type="spellEnd"/>
+          </w:p>
+        </w:tc>
+        <w:tc>
+          <w:tcPr>
+            <w:tcW w:w="3005" w:type="dxa"/>
+          </w:tcPr>
+          <w:p>
+            <w:r>
+              <w:t>The core functionality of the application</w:t>
+            </w:r>
+          </w:p>
+        </w:tc>
+        <w:tc>
+          <w:tcPr>
+            <w:tcW w:w="3006" w:type="dxa"/>
+          </w:tcPr>
+          <w:p>
+            <w:r>
+              <w:t xml:space="preserve">Uses Struct and </w:t>
+            </w:r>
+            <w:proofErr w:type="spellStart"/>
+            <w:r>
+              <w:t>MoveRecord</w:t>
+            </w:r>
+            <w:proofErr w:type="spellEnd"/>
+            <w:r>
+              <w:t xml:space="preserve">, returns </w:t>
+            </w:r>
+            <w:proofErr w:type="spellStart"/>
+            <w:r>
+              <w:t>MoveResult</w:t>
+            </w:r>
+            <w:proofErr w:type="spellEnd"/>
+            <w:r>
+              <w:t xml:space="preserve"> and </w:t>
+            </w:r>
+            <w:proofErr w:type="spellStart"/>
+            <w:r>
+              <w:t>PieceType</w:t>
+            </w:r>
+            <w:proofErr w:type="spellEnd"/>
+          </w:p>
+        </w:tc>
+      </w:tr>
+      <w:tr>
+        <w:tc>
+          <w:tcPr>
+            <w:tcW w:w="3005" w:type="dxa"/>
+          </w:tcPr>
+          <w:p>
+            <w:r>
+              <w:t>«struct»</w:t>
+            </w:r>
+          </w:p>
+          <w:p>
+            <w:proofErr w:type="spellStart"/>
+            <w:r>
+              <w:t>MoveRecord</w:t>
+            </w:r>
+            <w:proofErr w:type="spellEnd"/>
+          </w:p>
+        </w:tc>
+        <w:tc>
+          <w:tcPr>
+            <w:tcW w:w="3005" w:type="dxa"/>
+          </w:tcPr>
+          <w:p>
+            <w:r>
+              <w:t>The structure for game movement records</w:t>
+            </w:r>
+          </w:p>
+        </w:tc>
+        <w:tc>
+          <w:tcPr>
+            <w:tcW w:w="3006" w:type="dxa"/>
+          </w:tcPr>
+          <w:p>
+            <w:r>
+              <w:t xml:space="preserve">Used by </w:t>
+            </w:r>
+            <w:proofErr w:type="spellStart"/>
+            <w:r>
+              <w:t>GamePlayer</w:t>
+            </w:r>
+            <w:proofErr w:type="spellEnd"/>
+            <w:r>
+              <w:t xml:space="preserve"> class</w:t>
+            </w:r>
+          </w:p>
+        </w:tc>
+      </w:tr>
+      <w:tr>
+        <w:tc>
+          <w:tcPr>
+            <w:tcW w:w="3005" w:type="dxa"/>
+          </w:tcPr>
+          <w:p>
+            <w:r>
+              <w:t>«</w:t>
+            </w:r>
+            <w:proofErr w:type="spellStart"/>
+            <w:r>
+              <w:t>enum</w:t>
+            </w:r>
+            <w:proofErr w:type="spellEnd"/>
+            <w:r>
+              <w:t>»</w:t>
+            </w:r>
+          </w:p>
+          <w:p>
+            <w:proofErr w:type="spellStart"/>
+            <w:r>
+              <w:t>MoveResult</w:t>
+            </w:r>
+            <w:proofErr w:type="spellEnd"/>
+          </w:p>
+        </w:tc>
+        <w:tc>
+          <w:tcPr>
+            <w:tcW w:w="3005" w:type="dxa"/>
+          </w:tcPr>
+          <w:p>
+            <w:r>
+              <w:t>Describ</w:t>
+            </w:r>
+            <w:r>
+              <w:t>ing</w:t>
+            </w:r>
+            <w:r>
+              <w:t xml:space="preserve"> the observable result of a move request.</w:t>
+            </w:r>
+          </w:p>
+        </w:tc>
+        <w:tc>
+          <w:tcPr>
+            <w:tcW w:w="3006" w:type="dxa"/>
+          </w:tcPr>
+          <w:p>
+            <w:r>
+              <w:t xml:space="preserve">Returned by </w:t>
+            </w:r>
+            <w:proofErr w:type="spellStart"/>
+            <w:r>
+              <w:t>GamePlayer</w:t>
+            </w:r>
+            <w:proofErr w:type="spellEnd"/>
+            <w:r>
+              <w:t xml:space="preserve"> class</w:t>
+            </w:r>
+          </w:p>
+        </w:tc>
+      </w:tr>
+      <w:tr>
+        <w:tc>
+          <w:tcPr>
+            <w:tcW w:w="3005" w:type="dxa"/>
+          </w:tcPr>
+          <w:p>
+            <w:r>
+              <w:t>«static»</w:t>
+            </w:r>
+          </w:p>
+          <w:p>
+            <w:proofErr w:type="spellStart"/>
+            <w:r>
+              <w:t>ReferenceBoardData</w:t>
+            </w:r>
+            <w:proofErr w:type="spellEnd"/>
+          </w:p>
+        </w:tc>
+        <w:tc>
+          <w:tcPr>
+            <w:tcW w:w="3005" w:type="dxa"/>
+          </w:tcPr>
+          <w:p>
+            <w:r>
+              <w:t>Provid</w:t>
+            </w:r>
+            <w:r>
+              <w:t>ing</w:t>
+            </w:r>
+            <w:r>
+              <w:t xml:space="preserve"> </w:t>
+            </w:r>
+            <w:r>
+              <w:t>a</w:t>
+            </w:r>
+            <w:r>
+              <w:t xml:space="preserve"> known-good in-memory board</w:t>
+            </w:r>
+          </w:p>
+        </w:tc>
+        <w:tc>
+          <w:tcPr>
+            <w:tcW w:w="3006" w:type="dxa"/>
+          </w:tcPr>
+          <w:p>
+            <w:r>
+              <w:t xml:space="preserve">Used by </w:t>
+            </w:r>
+            <w:proofErr w:type="spellStart"/>
+            <w:r>
+              <w:t>GamePlayer</w:t>
+            </w:r>
+            <w:proofErr w:type="spellEnd"/>
+            <w:r>
+              <w:t xml:space="preserve"> class</w:t>
+            </w:r>
+          </w:p>
+        </w:tc>
+      </w:tr>
+      <w:tr>
+        <w:tc>
+          <w:tcPr>
+            <w:tcW w:w="3005" w:type="dxa"/>
+          </w:tcPr>
+          <w:p>
+            <w:r>
+              <w:t>«struct»</w:t>
+            </w:r>
+          </w:p>
+          <w:p>
+            <w:r>
+              <w:t>Position</w:t>
+            </w:r>
+          </w:p>
+        </w:tc>
+        <w:tc>
+          <w:tcPr>
+            <w:tcW w:w="3005" w:type="dxa"/>
+          </w:tcPr>
+          <w:p>
+            <w:r>
+              <w:t>Identifying a coordinate/position in a board</w:t>
+            </w:r>
+          </w:p>
+        </w:tc>
+        <w:tc>
+          <w:tcPr>
+            <w:tcW w:w="3006" w:type="dxa"/>
+          </w:tcPr>
+          <w:p>
+            <w:r>
+              <w:t xml:space="preserve">Used by </w:t>
+            </w:r>
+            <w:proofErr w:type="spellStart"/>
+            <w:r>
+              <w:t>GamePlayer</w:t>
+            </w:r>
+            <w:proofErr w:type="spellEnd"/>
+            <w:r>
+              <w:t xml:space="preserve"> class and </w:t>
+            </w:r>
+            <w:proofErr w:type="spellStart"/>
+            <w:r>
+              <w:t>ReferenceBoardData</w:t>
+            </w:r>
+            <w:proofErr w:type="spellEnd"/>
+            <w:r>
+              <w:t xml:space="preserve">, Contained in </w:t>
+            </w:r>
+            <w:proofErr w:type="spellStart"/>
+            <w:r>
+              <w:t>MoveRecord</w:t>
+            </w:r>
+            <w:proofErr w:type="spellEnd"/>
+          </w:p>
+        </w:tc>
+      </w:tr>
+      <w:tr>
+        <w:tc>
+          <w:tcPr>
+            <w:tcW w:w="3005" w:type="dxa"/>
+          </w:tcPr>
+          <w:p>
+            <w:r>
+              <w:t>«</w:t>
+            </w:r>
+            <w:proofErr w:type="spellStart"/>
+            <w:r>
+              <w:t>enum</w:t>
+            </w:r>
+            <w:proofErr w:type="spellEnd"/>
+            <w:r>
+              <w:t>»</w:t>
+            </w:r>
+          </w:p>
+          <w:p>
+            <w:proofErr w:type="spellStart"/>
+            <w:r>
+              <w:t>PieceType</w:t>
+            </w:r>
+            <w:proofErr w:type="spellEnd"/>
+          </w:p>
+        </w:tc>
+        <w:tc>
+          <w:tcPr>
+            <w:tcW w:w="3005" w:type="dxa"/>
+          </w:tcPr>
+          <w:p>
+            <w:r>
+              <w:t>Identify</w:t>
+            </w:r>
+            <w:r>
+              <w:t>ing</w:t>
+            </w:r>
+            <w:r>
+              <w:t xml:space="preserve"> a supported chess movement rule.</w:t>
+            </w:r>
+          </w:p>
+        </w:tc>
+        <w:tc>
+          <w:tcPr>
+            <w:tcW w:w="3006" w:type="dxa"/>
+          </w:tcPr>
+          <w:p>
+            <w:r>
+              <w:t xml:space="preserve">Used by </w:t>
+            </w:r>
+            <w:proofErr w:type="spellStart"/>
+            <w:r>
+              <w:t>ReferenceBoardData</w:t>
+            </w:r>
+            <w:proofErr w:type="spellEnd"/>
+            <w:r>
+              <w:t xml:space="preserve">, contained in </w:t>
+            </w:r>
+            <w:proofErr w:type="spellStart"/>
+            <w:r>
+              <w:t>MoveRecord</w:t>
+            </w:r>
+            <w:proofErr w:type="spellEnd"/>
+            <w:r>
+              <w:t xml:space="preserve">, returned by </w:t>
+            </w:r>
+            <w:proofErr w:type="spellStart"/>
+            <w:r>
+              <w:t>GamePlayer</w:t>
+            </w:r>
+            <w:proofErr w:type="spellEnd"/>
+          </w:p>
+        </w:tc>
+      </w:tr>
+    </w:tbl>
+    <w:p/>
+    <w:p>
+      <w:r>
+        <w:br w:type="page"/>
+      </w:r>
+    </w:p>
+    <w:p>
+      <w:pPr>
+        <w:pStyle w:val="Heading2"/>
+      </w:pPr>
+      <w:r>
+        <w:lastRenderedPageBreak/>
+        <w:t>Automated testing evidence</w:t>
+      </w:r>
+    </w:p>
+    <w:tbl>
+      <w:tblPr>
+        <w:tblStyle w:val="TableGrid"/>
+        <w:tblW w:w="9757" w:type="dxa"/>
+        <w:tblLook w:val="04A0" w:firstRow="1" w:lastRow="0" w:firstColumn="1" w:lastColumn="0" w:noHBand="0" w:noVBand="1"/>
+      </w:tblPr>
+      <w:tblGrid>
+        <w:gridCol w:w="2092"/>
+        <w:gridCol w:w="4925"/>
+        <w:gridCol w:w="2016"/>
+        <w:gridCol w:w="799"/>
+      </w:tblGrid>
+      <w:tr>
+        <w:tc>
+          <w:tcPr>
+            <w:tcW w:w="2092" w:type="dxa"/>
+          </w:tcPr>
+          <w:p>
+            <w:pPr>
+              <w:rPr>
+                <w:b/>
+                <w:bCs/>
+              </w:rPr>
+            </w:pPr>
+            <w:r>
+              <w:rPr>
+                <w:b/>
+                <w:bCs/>
+              </w:rPr>
+              <w:t>Risk/Requirement</w:t>
+            </w:r>
+          </w:p>
+        </w:tc>
+        <w:tc>
+          <w:tcPr>
+            <w:tcW w:w="4850" w:type="dxa"/>
+          </w:tcPr>
+          <w:p>
+            <w:pPr>
+              <w:rPr>
+                <w:b/>
+                <w:bCs/>
+              </w:rPr>
+            </w:pPr>
+            <w:r>
+              <w:rPr>
+                <w:b/>
+                <w:bCs/>
+              </w:rPr>
+              <w:t>Selected test</w:t>
+            </w:r>
+          </w:p>
+        </w:tc>
+        <w:tc>
+          <w:tcPr>
+            <w:tcW w:w="2016" w:type="dxa"/>
+          </w:tcPr>
+          <w:p>
+            <w:pPr>
+              <w:rPr>
+                <w:b/>
+                <w:bCs/>
+              </w:rPr>
+            </w:pPr>
+            <w:r>
+              <w:rPr>
+                <w:b/>
+                <w:bCs/>
+              </w:rPr>
+              <w:t>Expected result</w:t>
+            </w:r>
+          </w:p>
+        </w:tc>
+        <w:tc>
+          <w:tcPr>
+            <w:tcW w:w="799" w:type="dxa"/>
+          </w:tcPr>
+          <w:p>
+            <w:pPr>
+              <w:rPr>
+                <w:b/>
+                <w:bCs/>
+              </w:rPr>
+            </w:pPr>
+            <w:r>
+              <w:rPr>
+                <w:b/>
+                <w:bCs/>
+              </w:rPr>
+              <w:t>Run result</w:t>
+            </w:r>
+          </w:p>
+        </w:tc>
+      </w:tr>
+      <w:tr>
+        <w:tc>
+          <w:tcPr>
+            <w:tcW w:w="2092" w:type="dxa"/>
+          </w:tcPr>
+          <w:p>
+            <w:r>
+              <w:t>Game initializes successfully</w:t>
+            </w:r>
+          </w:p>
+        </w:tc>
+        <w:tc>
+          <w:tcPr>
+            <w:tcW w:w="4850" w:type="dxa"/>
+          </w:tcPr>
+          <w:p>
+            <w:proofErr w:type="spellStart"/>
+            <w:r>
+              <w:t>NewGame_InitializesSuccesfully</w:t>
+            </w:r>
+            <w:proofErr w:type="spellEnd"/>
+          </w:p>
+        </w:tc>
+        <w:tc>
+          <w:tcPr>
+            <w:tcW w:w="2016" w:type="dxa"/>
+          </w:tcPr>
+          <w:p>
+            <w:pPr>
+              <w:rPr>
+                <w:sz w:val="18"/>
+                <w:szCs w:val="18"/>
+              </w:rPr>
+            </w:pPr>
+            <w:r>
+              <w:rPr>
+                <w:sz w:val="18"/>
+                <w:szCs w:val="18"/>
+              </w:rPr>
+              <w:t>Rows = 6,</w:t>
+            </w:r>
+          </w:p>
+          <w:p>
+            <w:pPr>
+              <w:rPr>
+                <w:sz w:val="18"/>
+                <w:szCs w:val="18"/>
+              </w:rPr>
+            </w:pPr>
+            <w:r>
+              <w:rPr>
+                <w:sz w:val="18"/>
+                <w:szCs w:val="18"/>
+              </w:rPr>
+              <w:t>Columns = 6,</w:t>
+            </w:r>
+          </w:p>
+          <w:p>
+            <w:pPr>
+              <w:rPr>
+                <w:sz w:val="18"/>
+                <w:szCs w:val="18"/>
+              </w:rPr>
+            </w:pPr>
+            <w:r>
+              <w:rPr>
+                <w:sz w:val="18"/>
+                <w:szCs w:val="18"/>
+              </w:rPr>
+              <w:t>Game not complete,</w:t>
+            </w:r>
+          </w:p>
+          <w:p>
+            <w:pPr>
+              <w:rPr>
+                <w:sz w:val="18"/>
+                <w:szCs w:val="18"/>
+              </w:rPr>
+            </w:pPr>
+            <w:r>
+              <w:rPr>
+                <w:sz w:val="18"/>
+                <w:szCs w:val="18"/>
+              </w:rPr>
+              <w:t>Move History = 0</w:t>
+            </w:r>
+          </w:p>
+        </w:tc>
+        <w:tc>
+          <w:tcPr>
+            <w:tcW w:w="799" w:type="dxa"/>
+          </w:tcPr>
+          <w:p>
+            <w:r>
+              <w:t>Pass</w:t>
+            </w:r>
+          </w:p>
+        </w:tc>
+      </w:tr>
+      <w:tr>
+        <w:tc>
+          <w:tcPr>
+            <w:tcW w:w="2092" w:type="dxa"/>
+          </w:tcPr>
+          <w:p>
+            <w:r>
+              <w:t>Game initializes with player objects in the correct locations</w:t>
+            </w:r>
+          </w:p>
+        </w:tc>
+        <w:tc>
+          <w:tcPr>
+            <w:tcW w:w="4850" w:type="dxa"/>
+          </w:tcPr>
+          <w:p>
+            <w:proofErr w:type="spellStart"/>
+            <w:r>
+              <w:t>NewGame_CorrectPlayerPositions</w:t>
+            </w:r>
+            <w:proofErr w:type="spellEnd"/>
+          </w:p>
+        </w:tc>
+        <w:tc>
+          <w:tcPr>
+            <w:tcW w:w="2016" w:type="dxa"/>
+          </w:tcPr>
+          <w:p>
+            <w:pPr>
+              <w:rPr>
+                <w:sz w:val="18"/>
+                <w:szCs w:val="18"/>
+              </w:rPr>
+            </w:pPr>
+            <w:proofErr w:type="spellStart"/>
+            <w:r>
+              <w:rPr>
+                <w:sz w:val="18"/>
+                <w:szCs w:val="18"/>
+              </w:rPr>
+              <w:t>StartPosition</w:t>
+            </w:r>
+            <w:proofErr w:type="spellEnd"/>
+            <w:r>
+              <w:rPr>
+                <w:sz w:val="18"/>
+                <w:szCs w:val="18"/>
+              </w:rPr>
+              <w:t xml:space="preserve"> = 5,0</w:t>
+            </w:r>
+          </w:p>
+          <w:p>
+            <w:pPr>
+              <w:rPr>
+                <w:sz w:val="18"/>
+                <w:szCs w:val="18"/>
+              </w:rPr>
+            </w:pPr>
+            <w:proofErr w:type="spellStart"/>
+            <w:r>
+              <w:rPr>
+                <w:sz w:val="18"/>
+                <w:szCs w:val="18"/>
+              </w:rPr>
+              <w:t>CurrentPosition</w:t>
+            </w:r>
+            <w:proofErr w:type="spellEnd"/>
+            <w:r>
+              <w:rPr>
+                <w:sz w:val="18"/>
+                <w:szCs w:val="18"/>
+              </w:rPr>
+              <w:t>= 5,0</w:t>
+            </w:r>
+          </w:p>
+          <w:p>
+            <w:pPr>
+              <w:rPr>
+                <w:sz w:val="18"/>
+                <w:szCs w:val="18"/>
+              </w:rPr>
+            </w:pPr>
+            <w:proofErr w:type="spellStart"/>
+            <w:r>
+              <w:rPr>
+                <w:sz w:val="18"/>
+                <w:szCs w:val="18"/>
+              </w:rPr>
+              <w:t>TargetPosition</w:t>
+            </w:r>
+            <w:proofErr w:type="spellEnd"/>
+            <w:r>
+              <w:rPr>
+                <w:sz w:val="18"/>
+                <w:szCs w:val="18"/>
+              </w:rPr>
+              <w:t xml:space="preserve"> = 0,5</w:t>
+            </w:r>
+          </w:p>
+        </w:tc>
+        <w:tc>
+          <w:tcPr>
+            <w:tcW w:w="799" w:type="dxa"/>
+          </w:tcPr>
+          <w:p>
+            <w:r>
+              <w:t>Pass</w:t>
+            </w:r>
+          </w:p>
+        </w:tc>
+      </w:tr>
+      <w:tr>
+        <w:tc>
+          <w:tcPr>
+            <w:tcW w:w="2092" w:type="dxa"/>
+          </w:tcPr>
+          <w:p>
+            <w:r>
+              <w:t>Game initializes with pieces in correct locations</w:t>
+            </w:r>
+          </w:p>
+        </w:tc>
+        <w:tc>
+          <w:tcPr>
+            <w:tcW w:w="4850" w:type="dxa"/>
+          </w:tcPr>
+          <w:p>
+            <w:proofErr w:type="spellStart"/>
+            <w:r>
+              <w:t>NewGame_CorrectPiecePositions</w:t>
+            </w:r>
+            <w:proofErr w:type="spellEnd"/>
+          </w:p>
+        </w:tc>
+        <w:tc>
+          <w:tcPr>
+            <w:tcW w:w="2016" w:type="dxa"/>
+          </w:tcPr>
+          <w:p>
+            <w:pPr>
+              <w:rPr>
+                <w:sz w:val="18"/>
+                <w:szCs w:val="18"/>
+              </w:rPr>
+            </w:pPr>
+            <w:r>
+              <w:rPr>
+                <w:sz w:val="18"/>
+                <w:szCs w:val="18"/>
+              </w:rPr>
+              <w:t>Rook = 5,0</w:t>
+            </w:r>
+          </w:p>
+          <w:p>
+            <w:pPr>
+              <w:rPr>
+                <w:sz w:val="18"/>
+                <w:szCs w:val="18"/>
+              </w:rPr>
+            </w:pPr>
+            <w:r>
+              <w:rPr>
+                <w:sz w:val="18"/>
+                <w:szCs w:val="18"/>
+              </w:rPr>
+              <w:t>Bishop = 5,3</w:t>
+            </w:r>
+          </w:p>
+          <w:p>
+            <w:pPr>
+              <w:rPr>
+                <w:sz w:val="18"/>
+                <w:szCs w:val="18"/>
+              </w:rPr>
+            </w:pPr>
+            <w:r>
+              <w:rPr>
+                <w:sz w:val="18"/>
+                <w:szCs w:val="18"/>
+              </w:rPr>
+              <w:t>Knight = 3,5</w:t>
+            </w:r>
+          </w:p>
+          <w:p>
+            <w:pPr>
+              <w:rPr>
+                <w:sz w:val="18"/>
+                <w:szCs w:val="18"/>
+              </w:rPr>
+            </w:pPr>
+            <w:r>
+              <w:rPr>
+                <w:sz w:val="18"/>
+                <w:szCs w:val="18"/>
+              </w:rPr>
+              <w:t>King = 1,4</w:t>
+            </w:r>
+          </w:p>
+          <w:p>
+            <w:pPr>
+              <w:rPr>
+                <w:sz w:val="18"/>
+                <w:szCs w:val="18"/>
+              </w:rPr>
+            </w:pPr>
+            <w:r>
+              <w:rPr>
+                <w:sz w:val="18"/>
+                <w:szCs w:val="18"/>
+              </w:rPr>
+              <w:t>Empty squares = null</w:t>
+            </w:r>
+          </w:p>
+        </w:tc>
+        <w:tc>
+          <w:tcPr>
+            <w:tcW w:w="799" w:type="dxa"/>
+          </w:tcPr>
+          <w:p>
+            <w:r>
+              <w:t>Pass</w:t>
+            </w:r>
+          </w:p>
+        </w:tc>
+      </w:tr>
+      <w:tr>
+        <w:tc>
+          <w:tcPr>
+            <w:tcW w:w="2092" w:type="dxa"/>
+          </w:tcPr>
+          <w:p>
+            <w:r>
+              <w:t>Game restarts back to default values</w:t>
+            </w:r>
+          </w:p>
+        </w:tc>
+        <w:tc>
+          <w:tcPr>
+            <w:tcW w:w="4850" w:type="dxa"/>
+          </w:tcPr>
+          <w:p>
+            <w:proofErr w:type="spellStart"/>
+            <w:r>
+              <w:t>Restart_InitializesSuccesfully</w:t>
+            </w:r>
+            <w:proofErr w:type="spellEnd"/>
+          </w:p>
+        </w:tc>
+        <w:tc>
+          <w:tcPr>
+            <w:tcW w:w="2016" w:type="dxa"/>
+          </w:tcPr>
+          <w:p>
+            <w:pPr>
+              <w:rPr>
+                <w:sz w:val="18"/>
+                <w:szCs w:val="18"/>
+              </w:rPr>
+            </w:pPr>
+            <w:r>
+              <w:rPr>
+                <w:sz w:val="18"/>
+                <w:szCs w:val="18"/>
+              </w:rPr>
+              <w:t>Rows = 6,</w:t>
+            </w:r>
+          </w:p>
+          <w:p>
+            <w:pPr>
+              <w:rPr>
+                <w:sz w:val="18"/>
+                <w:szCs w:val="18"/>
+              </w:rPr>
+            </w:pPr>
+            <w:r>
+              <w:rPr>
+                <w:sz w:val="18"/>
+                <w:szCs w:val="18"/>
+              </w:rPr>
+              <w:t>Columns = 6,</w:t>
+            </w:r>
+          </w:p>
+          <w:p>
+            <w:pPr>
+              <w:rPr>
+                <w:sz w:val="18"/>
+                <w:szCs w:val="18"/>
+              </w:rPr>
+            </w:pPr>
+            <w:r>
+              <w:rPr>
+                <w:sz w:val="18"/>
+                <w:szCs w:val="18"/>
+              </w:rPr>
+              <w:t>Game not complete,</w:t>
+            </w:r>
+          </w:p>
+          <w:p>
+            <w:pPr>
+              <w:rPr>
+                <w:sz w:val="18"/>
+                <w:szCs w:val="18"/>
+              </w:rPr>
+            </w:pPr>
+            <w:r>
+              <w:rPr>
+                <w:sz w:val="18"/>
+                <w:szCs w:val="18"/>
+              </w:rPr>
+              <w:t>Move History = 0</w:t>
+            </w:r>
+          </w:p>
+        </w:tc>
+        <w:tc>
+          <w:tcPr>
+            <w:tcW w:w="799" w:type="dxa"/>
+          </w:tcPr>
+          <w:p>
+            <w:r>
+              <w:t>Pass</w:t>
+            </w:r>
+          </w:p>
+        </w:tc>
+      </w:tr>
+      <w:tr>
+        <w:tc>
+          <w:tcPr>
+            <w:tcW w:w="2092" w:type="dxa"/>
+          </w:tcPr>
+          <w:p>
+            <w:r>
+              <w:t>Player positions return to default after restart</w:t>
+            </w:r>
+          </w:p>
+        </w:tc>
+        <w:tc>
+          <w:tcPr>
+            <w:tcW w:w="4850" w:type="dxa"/>
+          </w:tcPr>
+          <w:p>
+            <w:proofErr w:type="spellStart"/>
+            <w:r>
+              <w:t>Restart_CorrectPlayerPositions</w:t>
+            </w:r>
+            <w:proofErr w:type="spellEnd"/>
+          </w:p>
           <w:p/>
         </w:tc>
         <w:tc>
           <w:tcPr>
-            <w:tcW w:w="3005" w:type="dxa"/>
-          </w:tcPr>
+            <w:tcW w:w="2016" w:type="dxa"/>
+          </w:tcPr>
+          <w:p>
+            <w:pPr>
+              <w:rPr>
+                <w:sz w:val="18"/>
+                <w:szCs w:val="18"/>
+              </w:rPr>
+            </w:pPr>
+            <w:proofErr w:type="spellStart"/>
+            <w:r>
+              <w:rPr>
+                <w:sz w:val="18"/>
+                <w:szCs w:val="18"/>
+              </w:rPr>
+              <w:t>StartPosition</w:t>
+            </w:r>
+            <w:proofErr w:type="spellEnd"/>
+            <w:r>
+              <w:rPr>
+                <w:sz w:val="18"/>
+                <w:szCs w:val="18"/>
+              </w:rPr>
+              <w:t xml:space="preserve"> = 5,0</w:t>
+            </w:r>
+          </w:p>
+          <w:p>
+            <w:pPr>
+              <w:rPr>
+                <w:sz w:val="18"/>
+                <w:szCs w:val="18"/>
+              </w:rPr>
+            </w:pPr>
+            <w:proofErr w:type="spellStart"/>
+            <w:r>
+              <w:rPr>
+                <w:sz w:val="18"/>
+                <w:szCs w:val="18"/>
+              </w:rPr>
+              <w:t>CurrentPosition</w:t>
+            </w:r>
+            <w:proofErr w:type="spellEnd"/>
+            <w:r>
+              <w:rPr>
+                <w:sz w:val="18"/>
+                <w:szCs w:val="18"/>
+              </w:rPr>
+              <w:t>= 5,0</w:t>
+            </w:r>
+          </w:p>
+          <w:p>
+            <w:pPr>
+              <w:rPr>
+                <w:sz w:val="18"/>
+                <w:szCs w:val="18"/>
+              </w:rPr>
+            </w:pPr>
+            <w:proofErr w:type="spellStart"/>
+            <w:r>
+              <w:rPr>
+                <w:sz w:val="18"/>
+                <w:szCs w:val="18"/>
+              </w:rPr>
+              <w:t>TargetPosition</w:t>
+            </w:r>
+            <w:proofErr w:type="spellEnd"/>
+            <w:r>
+              <w:rPr>
+                <w:sz w:val="18"/>
+                <w:szCs w:val="18"/>
+              </w:rPr>
+              <w:t xml:space="preserve"> = 0,5</w:t>
+            </w:r>
+          </w:p>
+        </w:tc>
+        <w:tc>
+          <w:tcPr>
+            <w:tcW w:w="799" w:type="dxa"/>
+          </w:tcPr>
+          <w:p>
+            <w:r>
+              <w:t>Pass</w:t>
+            </w:r>
+          </w:p>
+        </w:tc>
+      </w:tr>
+      <w:tr>
+        <w:tc>
+          <w:tcPr>
+            <w:tcW w:w="2092" w:type="dxa"/>
+          </w:tcPr>
+          <w:p>
+            <w:r>
+              <w:t xml:space="preserve">Game returns </w:t>
+            </w:r>
+            <w:proofErr w:type="spellStart"/>
+            <w:r>
+              <w:t>OutOfBounds</w:t>
+            </w:r>
+            <w:proofErr w:type="spellEnd"/>
+            <w:r>
+              <w:t xml:space="preserve"> for positions outside of playable game board</w:t>
+            </w:r>
+          </w:p>
+        </w:tc>
+        <w:tc>
+          <w:tcPr>
+            <w:tcW w:w="4850" w:type="dxa"/>
+          </w:tcPr>
+          <w:p>
+            <w:pPr>
+              <w:rPr>
+                <w:sz w:val="18"/>
+                <w:szCs w:val="18"/>
+              </w:rPr>
+            </w:pPr>
+            <w:proofErr w:type="spellStart"/>
+            <w:r>
+              <w:rPr>
+                <w:sz w:val="18"/>
+                <w:szCs w:val="18"/>
+              </w:rPr>
+              <w:t>TryMove_OutOfBounds_ReturnsOutOfBounds</w:t>
+            </w:r>
+            <w:proofErr w:type="spellEnd"/>
+          </w:p>
           <w:p/>
         </w:tc>
         <w:tc>
           <w:tcPr>
-            <w:tcW w:w="3006" w:type="dxa"/>
-          </w:tcPr>
-          <w:p/>
+            <w:tcW w:w="2016" w:type="dxa"/>
+          </w:tcPr>
+          <w:p>
+            <w:pPr>
+              <w:rPr>
+                <w:sz w:val="18"/>
+                <w:szCs w:val="18"/>
+              </w:rPr>
+            </w:pPr>
+            <w:proofErr w:type="spellStart"/>
+            <w:r>
+              <w:rPr>
+                <w:sz w:val="18"/>
+                <w:szCs w:val="18"/>
+              </w:rPr>
+              <w:t>OutOfBounds</w:t>
+            </w:r>
+            <w:proofErr w:type="spellEnd"/>
+          </w:p>
+        </w:tc>
+        <w:tc>
+          <w:tcPr>
+            <w:tcW w:w="799" w:type="dxa"/>
+          </w:tcPr>
+          <w:p>
+            <w:r>
+              <w:t>Pass</w:t>
+            </w:r>
+          </w:p>
+        </w:tc>
+      </w:tr>
+      <w:tr>
+        <w:tc>
+          <w:tcPr>
+            <w:tcW w:w="2092" w:type="dxa"/>
+          </w:tcPr>
+          <w:p>
+            <w:r>
+              <w:t>Game disregards any further moves after game has completed</w:t>
+            </w:r>
+          </w:p>
+        </w:tc>
+        <w:tc>
+          <w:tcPr>
+            <w:tcW w:w="4850" w:type="dxa"/>
+          </w:tcPr>
+          <w:p>
+            <w:pPr>
+              <w:rPr>
+                <w:sz w:val="18"/>
+                <w:szCs w:val="18"/>
+              </w:rPr>
+            </w:pPr>
+            <w:proofErr w:type="spellStart"/>
+            <w:r>
+              <w:rPr>
+                <w:sz w:val="18"/>
+                <w:szCs w:val="18"/>
+              </w:rPr>
+              <w:t>TryMove_GameCompleted_ReturnsGameAlreadyCompleted</w:t>
+            </w:r>
+            <w:proofErr w:type="spellEnd"/>
+          </w:p>
+          <w:p>
+            <w:pPr>
+              <w:rPr>
+                <w:sz w:val="18"/>
+                <w:szCs w:val="18"/>
+              </w:rPr>
+            </w:pPr>
+          </w:p>
+        </w:tc>
+        <w:tc>
+          <w:tcPr>
+            <w:tcW w:w="2016" w:type="dxa"/>
+          </w:tcPr>
+          <w:p>
+            <w:pPr>
+              <w:rPr>
+                <w:sz w:val="18"/>
+                <w:szCs w:val="18"/>
+              </w:rPr>
+            </w:pPr>
+            <w:proofErr w:type="spellStart"/>
+            <w:r>
+              <w:rPr>
+                <w:sz w:val="18"/>
+                <w:szCs w:val="18"/>
+              </w:rPr>
+              <w:t>GameAlreadyCompleted</w:t>
+            </w:r>
+            <w:proofErr w:type="spellEnd"/>
+          </w:p>
+          <w:p>
+            <w:pPr>
+              <w:rPr>
+                <w:sz w:val="18"/>
+                <w:szCs w:val="18"/>
+              </w:rPr>
+            </w:pPr>
+          </w:p>
+        </w:tc>
+        <w:tc>
+          <w:tcPr>
+            <w:tcW w:w="799" w:type="dxa"/>
+          </w:tcPr>
+          <w:p>
+            <w:r>
+              <w:t>Pass</w:t>
+            </w:r>
+          </w:p>
+        </w:tc>
+      </w:tr>
+      <w:tr>
+        <w:tc>
+          <w:tcPr>
+            <w:tcW w:w="2092" w:type="dxa"/>
+          </w:tcPr>
+          <w:p>
+            <w:r>
+              <w:t xml:space="preserve">Game disregards illegal </w:t>
+            </w:r>
+            <w:r>
+              <w:t>piece</w:t>
+            </w:r>
+            <w:r>
+              <w:t xml:space="preserve"> movements</w:t>
+            </w:r>
+          </w:p>
+        </w:tc>
+        <w:tc>
+          <w:tcPr>
+            <w:tcW w:w="4850" w:type="dxa"/>
+          </w:tcPr>
+          <w:p>
+            <w:pPr>
+              <w:rPr>
+                <w:sz w:val="18"/>
+                <w:szCs w:val="18"/>
+              </w:rPr>
+            </w:pPr>
+            <w:proofErr w:type="spellStart"/>
+            <w:r>
+              <w:rPr>
+                <w:sz w:val="18"/>
+                <w:szCs w:val="18"/>
+              </w:rPr>
+              <w:t>TryMove_Rook_IllegalMove_ReturnsInvalidMovement</w:t>
+            </w:r>
+            <w:proofErr w:type="spellEnd"/>
+            <w:r>
+              <w:rPr>
+                <w:sz w:val="18"/>
+                <w:szCs w:val="18"/>
+              </w:rPr>
+              <w:t>,</w:t>
+            </w:r>
+          </w:p>
+          <w:p>
+            <w:pPr>
+              <w:rPr>
+                <w:sz w:val="18"/>
+                <w:szCs w:val="18"/>
+              </w:rPr>
+            </w:pPr>
+            <w:proofErr w:type="spellStart"/>
+            <w:r>
+              <w:rPr>
+                <w:sz w:val="18"/>
+                <w:szCs w:val="18"/>
+              </w:rPr>
+              <w:t>TryMove_</w:t>
+            </w:r>
+            <w:r>
+              <w:rPr>
+                <w:sz w:val="18"/>
+                <w:szCs w:val="18"/>
+              </w:rPr>
+              <w:t>Bishop</w:t>
+            </w:r>
+            <w:r>
+              <w:rPr>
+                <w:sz w:val="18"/>
+                <w:szCs w:val="18"/>
+              </w:rPr>
+              <w:t>_IllegalMove_ReturnsInvalidMovement</w:t>
+            </w:r>
+            <w:proofErr w:type="spellEnd"/>
+            <w:r>
+              <w:rPr>
+                <w:sz w:val="18"/>
+                <w:szCs w:val="18"/>
+              </w:rPr>
+              <w:t>,</w:t>
+            </w:r>
+          </w:p>
+          <w:p>
+            <w:pPr>
+              <w:rPr>
+                <w:sz w:val="18"/>
+                <w:szCs w:val="18"/>
+              </w:rPr>
+            </w:pPr>
+            <w:proofErr w:type="spellStart"/>
+            <w:r>
+              <w:rPr>
+                <w:sz w:val="18"/>
+                <w:szCs w:val="18"/>
+              </w:rPr>
+              <w:t>TryMove_</w:t>
+            </w:r>
+            <w:r>
+              <w:rPr>
+                <w:sz w:val="18"/>
+                <w:szCs w:val="18"/>
+              </w:rPr>
+              <w:t>Knight</w:t>
+            </w:r>
+            <w:r>
+              <w:rPr>
+                <w:sz w:val="18"/>
+                <w:szCs w:val="18"/>
+              </w:rPr>
+              <w:t>_IllegalMove_ReturnsInvalidMovement</w:t>
+            </w:r>
+            <w:proofErr w:type="spellEnd"/>
+            <w:r>
+              <w:rPr>
+                <w:sz w:val="18"/>
+                <w:szCs w:val="18"/>
+              </w:rPr>
+              <w:t>,</w:t>
+            </w:r>
+          </w:p>
+          <w:p>
+            <w:pPr>
+              <w:rPr>
+                <w:sz w:val="18"/>
+                <w:szCs w:val="18"/>
+              </w:rPr>
+            </w:pPr>
+            <w:proofErr w:type="spellStart"/>
+            <w:r>
+              <w:rPr>
+                <w:sz w:val="18"/>
+                <w:szCs w:val="18"/>
+              </w:rPr>
+              <w:t>TryMove_</w:t>
+            </w:r>
+            <w:r>
+              <w:rPr>
+                <w:sz w:val="18"/>
+                <w:szCs w:val="18"/>
+              </w:rPr>
+              <w:t>King</w:t>
+            </w:r>
+            <w:r>
+              <w:rPr>
+                <w:sz w:val="18"/>
+                <w:szCs w:val="18"/>
+              </w:rPr>
+              <w:t>_IllegalMove_ReturnsInvalidMovement</w:t>
+            </w:r>
+            <w:proofErr w:type="spellEnd"/>
+          </w:p>
+          <w:p>
+            <w:pPr>
+              <w:rPr>
+                <w:sz w:val="18"/>
+                <w:szCs w:val="18"/>
+              </w:rPr>
+            </w:pPr>
+          </w:p>
+          <w:p>
+            <w:pPr>
+              <w:rPr>
+                <w:sz w:val="18"/>
+                <w:szCs w:val="18"/>
+              </w:rPr>
+            </w:pPr>
+          </w:p>
+        </w:tc>
+        <w:tc>
+          <w:tcPr>
+            <w:tcW w:w="2016" w:type="dxa"/>
+          </w:tcPr>
+          <w:p>
+            <w:pPr>
+              <w:rPr>
+                <w:sz w:val="18"/>
+                <w:szCs w:val="18"/>
+              </w:rPr>
+            </w:pPr>
+            <w:proofErr w:type="spellStart"/>
+            <w:r>
+              <w:rPr>
+                <w:sz w:val="18"/>
+                <w:szCs w:val="18"/>
+              </w:rPr>
+              <w:t>InvalidMovement</w:t>
+            </w:r>
+            <w:proofErr w:type="spellEnd"/>
+          </w:p>
+          <w:p>
+            <w:pPr>
+              <w:rPr>
+                <w:sz w:val="18"/>
+                <w:szCs w:val="18"/>
+              </w:rPr>
+            </w:pPr>
+          </w:p>
+        </w:tc>
+        <w:tc>
+          <w:tcPr>
+            <w:tcW w:w="799" w:type="dxa"/>
+          </w:tcPr>
+          <w:p>
+            <w:r>
+              <w:t>Pass</w:t>
+            </w:r>
+          </w:p>
+        </w:tc>
+      </w:tr>
+      <w:tr>
+        <w:tc>
+          <w:tcPr>
+            <w:tcW w:w="2092" w:type="dxa"/>
+          </w:tcPr>
+          <w:p>
+            <w:r>
+              <w:t xml:space="preserve">Game </w:t>
+            </w:r>
+            <w:r>
+              <w:t xml:space="preserve">disregards </w:t>
+            </w:r>
+            <w:r>
+              <w:t>piece movements leading to empty squares</w:t>
+            </w:r>
+          </w:p>
+        </w:tc>
+        <w:tc>
+          <w:tcPr>
+            <w:tcW w:w="4850" w:type="dxa"/>
+          </w:tcPr>
+          <w:p>
+            <w:pPr>
+              <w:rPr>
+                <w:sz w:val="18"/>
+                <w:szCs w:val="18"/>
+              </w:rPr>
+            </w:pPr>
+            <w:proofErr w:type="spellStart"/>
+            <w:r>
+              <w:rPr>
+                <w:sz w:val="18"/>
+                <w:szCs w:val="18"/>
+              </w:rPr>
+              <w:t>TryMove_Rook_EmptyDestination_ReturnsInvalidDestination</w:t>
+            </w:r>
+            <w:proofErr w:type="spellEnd"/>
+            <w:r>
+              <w:rPr>
+                <w:sz w:val="18"/>
+                <w:szCs w:val="18"/>
+              </w:rPr>
+              <w:t>,</w:t>
+            </w:r>
+          </w:p>
+          <w:p>
+            <w:pPr>
+              <w:rPr>
+                <w:sz w:val="18"/>
+                <w:szCs w:val="18"/>
+              </w:rPr>
+            </w:pPr>
+            <w:proofErr w:type="spellStart"/>
+            <w:r>
+              <w:rPr>
+                <w:sz w:val="18"/>
+                <w:szCs w:val="18"/>
+              </w:rPr>
+              <w:t>TryMove_</w:t>
+            </w:r>
+            <w:r>
+              <w:rPr>
+                <w:sz w:val="18"/>
+                <w:szCs w:val="18"/>
+              </w:rPr>
+              <w:t>Bishop</w:t>
+            </w:r>
+            <w:r>
+              <w:rPr>
+                <w:sz w:val="18"/>
+                <w:szCs w:val="18"/>
+              </w:rPr>
+              <w:t>_EmptyDestination_ReturnsInvalidDestination</w:t>
+            </w:r>
+            <w:proofErr w:type="spellEnd"/>
+            <w:r>
+              <w:rPr>
+                <w:sz w:val="18"/>
+                <w:szCs w:val="18"/>
+              </w:rPr>
+              <w:t>,</w:t>
+            </w:r>
+          </w:p>
+          <w:p>
+            <w:pPr>
+              <w:rPr>
+                <w:sz w:val="18"/>
+                <w:szCs w:val="18"/>
+              </w:rPr>
+            </w:pPr>
+            <w:proofErr w:type="spellStart"/>
+            <w:r>
+              <w:rPr>
+                <w:sz w:val="18"/>
+                <w:szCs w:val="18"/>
+              </w:rPr>
+              <w:t>TryMove_</w:t>
+            </w:r>
+            <w:r>
+              <w:rPr>
+                <w:sz w:val="18"/>
+                <w:szCs w:val="18"/>
+              </w:rPr>
+              <w:t>Knight</w:t>
+            </w:r>
+            <w:r>
+              <w:rPr>
+                <w:sz w:val="18"/>
+                <w:szCs w:val="18"/>
+              </w:rPr>
+              <w:t>_EmptyDestination_ReturnsInvalidDestination</w:t>
+            </w:r>
+            <w:proofErr w:type="spellEnd"/>
+            <w:r>
+              <w:rPr>
+                <w:sz w:val="18"/>
+                <w:szCs w:val="18"/>
+              </w:rPr>
+              <w:t>,</w:t>
+            </w:r>
+          </w:p>
+          <w:p>
+            <w:pPr>
+              <w:rPr>
+                <w:sz w:val="18"/>
+                <w:szCs w:val="18"/>
+              </w:rPr>
+            </w:pPr>
+            <w:proofErr w:type="spellStart"/>
+            <w:r>
+              <w:rPr>
+                <w:sz w:val="18"/>
+                <w:szCs w:val="18"/>
+              </w:rPr>
+              <w:t>TryMove_</w:t>
+            </w:r>
+            <w:r>
+              <w:rPr>
+                <w:sz w:val="18"/>
+                <w:szCs w:val="18"/>
+              </w:rPr>
+              <w:t>King</w:t>
+            </w:r>
+            <w:r>
+              <w:rPr>
+                <w:sz w:val="18"/>
+                <w:szCs w:val="18"/>
+              </w:rPr>
+              <w:t>_EmptyDestination_ReturnsInvalidDestination</w:t>
+            </w:r>
+            <w:proofErr w:type="spellEnd"/>
+          </w:p>
+        </w:tc>
+        <w:tc>
+          <w:tcPr>
+            <w:tcW w:w="2016" w:type="dxa"/>
+          </w:tcPr>
+          <w:p>
+            <w:pPr>
+              <w:rPr>
+                <w:sz w:val="18"/>
+                <w:szCs w:val="18"/>
+              </w:rPr>
+            </w:pPr>
+            <w:proofErr w:type="spellStart"/>
+            <w:r>
+              <w:rPr>
+                <w:sz w:val="18"/>
+                <w:szCs w:val="18"/>
+              </w:rPr>
+              <w:t>InvalidDestination</w:t>
+            </w:r>
+            <w:proofErr w:type="spellEnd"/>
+          </w:p>
+        </w:tc>
+        <w:tc>
+          <w:tcPr>
+            <w:tcW w:w="799" w:type="dxa"/>
+          </w:tcPr>
+          <w:p>
+            <w:r>
+              <w:t>Pass</w:t>
+            </w:r>
+          </w:p>
+        </w:tc>
+      </w:tr>
+      <w:tr>
+        <w:tc>
+          <w:tcPr>
+            <w:tcW w:w="2092" w:type="dxa"/>
+          </w:tcPr>
+          <w:p>
+            <w:r>
+              <w:t xml:space="preserve">Game </w:t>
+            </w:r>
+            <w:r>
+              <w:t xml:space="preserve">disregards </w:t>
+            </w:r>
+            <w:r>
+              <w:t>piece</w:t>
+            </w:r>
+            <w:r>
+              <w:t xml:space="preserve"> movements that are blocked by other pieces</w:t>
+            </w:r>
+          </w:p>
+        </w:tc>
+        <w:tc>
+          <w:tcPr>
+            <w:tcW w:w="4850" w:type="dxa"/>
+          </w:tcPr>
+          <w:p>
+            <w:pPr>
+              <w:rPr>
+                <w:sz w:val="18"/>
+                <w:szCs w:val="18"/>
+              </w:rPr>
+            </w:pPr>
+            <w:proofErr w:type="spellStart"/>
+            <w:r>
+              <w:rPr>
+                <w:sz w:val="18"/>
+                <w:szCs w:val="18"/>
+              </w:rPr>
+              <w:t>TryMove_Rook_BlockedPath_ReturnsBlockedPath</w:t>
+            </w:r>
+            <w:proofErr w:type="spellEnd"/>
+            <w:r>
+              <w:rPr>
+                <w:sz w:val="18"/>
+                <w:szCs w:val="18"/>
+              </w:rPr>
+              <w:t>,</w:t>
+            </w:r>
+          </w:p>
+          <w:p>
+            <w:pPr>
+              <w:rPr>
+                <w:sz w:val="18"/>
+                <w:szCs w:val="18"/>
+              </w:rPr>
+            </w:pPr>
+            <w:proofErr w:type="spellStart"/>
+            <w:r>
+              <w:rPr>
+                <w:sz w:val="18"/>
+                <w:szCs w:val="18"/>
+              </w:rPr>
+              <w:t>TryMove_</w:t>
+            </w:r>
+            <w:r>
+              <w:rPr>
+                <w:sz w:val="18"/>
+                <w:szCs w:val="18"/>
+              </w:rPr>
+              <w:t>Bishop</w:t>
+            </w:r>
+            <w:r>
+              <w:rPr>
+                <w:sz w:val="18"/>
+                <w:szCs w:val="18"/>
+              </w:rPr>
+              <w:t>_BlockedPath_ReturnsBlockedPath</w:t>
+            </w:r>
+            <w:proofErr w:type="spellEnd"/>
+            <w:r>
+              <w:rPr>
+                <w:sz w:val="18"/>
+                <w:szCs w:val="18"/>
+              </w:rPr>
+              <w:t>,</w:t>
+            </w:r>
+          </w:p>
+          <w:p>
+            <w:pPr>
+              <w:rPr>
+                <w:sz w:val="18"/>
+                <w:szCs w:val="18"/>
+              </w:rPr>
+            </w:pPr>
+            <w:proofErr w:type="spellStart"/>
+            <w:r>
+              <w:rPr>
+                <w:sz w:val="18"/>
+                <w:szCs w:val="18"/>
+              </w:rPr>
+              <w:t>TryMove_</w:t>
+            </w:r>
+            <w:r>
+              <w:rPr>
+                <w:sz w:val="18"/>
+                <w:szCs w:val="18"/>
+              </w:rPr>
+              <w:t>Knight</w:t>
+            </w:r>
+            <w:r>
+              <w:rPr>
+                <w:sz w:val="18"/>
+                <w:szCs w:val="18"/>
+              </w:rPr>
+              <w:t>_BlockedPath_ReturnsBlockedPath</w:t>
+            </w:r>
+            <w:proofErr w:type="spellEnd"/>
+            <w:r>
+              <w:rPr>
+                <w:sz w:val="18"/>
+                <w:szCs w:val="18"/>
+              </w:rPr>
+              <w:t>,</w:t>
+            </w:r>
+          </w:p>
+          <w:p>
+            <w:pPr>
+              <w:rPr>
+                <w:sz w:val="18"/>
+                <w:szCs w:val="18"/>
+              </w:rPr>
+            </w:pPr>
+            <w:proofErr w:type="spellStart"/>
+            <w:r>
+              <w:rPr>
+                <w:sz w:val="18"/>
+                <w:szCs w:val="18"/>
+              </w:rPr>
+              <w:t>TryMove_</w:t>
+            </w:r>
+            <w:r>
+              <w:rPr>
+                <w:sz w:val="18"/>
+                <w:szCs w:val="18"/>
+              </w:rPr>
+              <w:t>King</w:t>
+            </w:r>
+            <w:r>
+              <w:rPr>
+                <w:sz w:val="18"/>
+                <w:szCs w:val="18"/>
+              </w:rPr>
+              <w:t>_BlockedPath_ReturnsBlockedPath</w:t>
+            </w:r>
+            <w:proofErr w:type="spellEnd"/>
+            <w:r>
+              <w:rPr>
+                <w:sz w:val="18"/>
+                <w:szCs w:val="18"/>
+              </w:rPr>
+              <w:t>,</w:t>
+            </w:r>
+          </w:p>
+          <w:p>
+            <w:pPr>
+              <w:rPr>
+                <w:sz w:val="18"/>
+                <w:szCs w:val="18"/>
+              </w:rPr>
+            </w:pPr>
+          </w:p>
+        </w:tc>
+        <w:tc>
+          <w:tcPr>
+            <w:tcW w:w="2016" w:type="dxa"/>
+          </w:tcPr>
+          <w:p>
+            <w:pPr>
+              <w:rPr>
+                <w:sz w:val="18"/>
+                <w:szCs w:val="18"/>
+              </w:rPr>
+            </w:pPr>
+            <w:proofErr w:type="spellStart"/>
+            <w:r>
+              <w:rPr>
+                <w:sz w:val="18"/>
+                <w:szCs w:val="18"/>
+              </w:rPr>
+              <w:t>P</w:t>
+            </w:r>
+            <w:r>
+              <w:rPr>
+                <w:sz w:val="18"/>
+                <w:szCs w:val="18"/>
+              </w:rPr>
+              <w:t>athBlocked</w:t>
+            </w:r>
+            <w:proofErr w:type="spellEnd"/>
+          </w:p>
+        </w:tc>
+        <w:tc>
+          <w:tcPr>
+            <w:tcW w:w="799" w:type="dxa"/>
+          </w:tcPr>
+          <w:p>
+            <w:r>
+              <w:t>Pass</w:t>
+            </w:r>
+          </w:p>
+        </w:tc>
+      </w:tr>
+      <w:tr>
+        <w:tc>
+          <w:tcPr>
+            <w:tcW w:w="2092" w:type="dxa"/>
+          </w:tcPr>
+          <w:p>
+            <w:r>
+              <w:t xml:space="preserve">Game accepts and records successful </w:t>
+            </w:r>
+            <w:r>
+              <w:t>piece</w:t>
+            </w:r>
+            <w:r>
+              <w:t xml:space="preserve"> move</w:t>
+            </w:r>
+          </w:p>
+        </w:tc>
+        <w:tc>
+          <w:tcPr>
+            <w:tcW w:w="4850" w:type="dxa"/>
+          </w:tcPr>
+          <w:p>
+            <w:pPr>
+              <w:rPr>
+                <w:sz w:val="18"/>
+                <w:szCs w:val="18"/>
+              </w:rPr>
+            </w:pPr>
+            <w:proofErr w:type="spellStart"/>
+            <w:r>
+              <w:rPr>
+                <w:sz w:val="18"/>
+                <w:szCs w:val="18"/>
+              </w:rPr>
+              <w:t>TryMove_Rook_SuccesfulMove_ReturnsSuccess</w:t>
+            </w:r>
+            <w:proofErr w:type="spellEnd"/>
+            <w:r>
+              <w:rPr>
+                <w:sz w:val="18"/>
+                <w:szCs w:val="18"/>
+              </w:rPr>
+              <w:t>,</w:t>
+            </w:r>
+          </w:p>
+          <w:p>
+            <w:pPr>
+              <w:rPr>
+                <w:sz w:val="18"/>
+                <w:szCs w:val="18"/>
+              </w:rPr>
+            </w:pPr>
+            <w:proofErr w:type="spellStart"/>
+            <w:r>
+              <w:rPr>
+                <w:sz w:val="18"/>
+                <w:szCs w:val="18"/>
+              </w:rPr>
+              <w:t>TryMove_</w:t>
+            </w:r>
+            <w:r>
+              <w:rPr>
+                <w:sz w:val="18"/>
+                <w:szCs w:val="18"/>
+              </w:rPr>
+              <w:t>Bishop</w:t>
+            </w:r>
+            <w:r>
+              <w:rPr>
+                <w:sz w:val="18"/>
+                <w:szCs w:val="18"/>
+              </w:rPr>
+              <w:t>_SuccesfulMove_ReturnsSuccess</w:t>
+            </w:r>
+            <w:proofErr w:type="spellEnd"/>
+            <w:r>
+              <w:rPr>
+                <w:sz w:val="18"/>
+                <w:szCs w:val="18"/>
+              </w:rPr>
+              <w:t>,</w:t>
+            </w:r>
+          </w:p>
+          <w:p>
+            <w:pPr>
+              <w:rPr>
+                <w:sz w:val="18"/>
+                <w:szCs w:val="18"/>
+              </w:rPr>
+            </w:pPr>
+            <w:proofErr w:type="spellStart"/>
+            <w:r>
+              <w:rPr>
+                <w:sz w:val="18"/>
+                <w:szCs w:val="18"/>
+              </w:rPr>
+              <w:t>TryMove_</w:t>
+            </w:r>
+            <w:r>
+              <w:rPr>
+                <w:sz w:val="18"/>
+                <w:szCs w:val="18"/>
+              </w:rPr>
+              <w:t>Knight</w:t>
+            </w:r>
+            <w:r>
+              <w:rPr>
+                <w:sz w:val="18"/>
+                <w:szCs w:val="18"/>
+              </w:rPr>
+              <w:t>_SuccesfulMove_ReturnsSuccess</w:t>
+            </w:r>
+            <w:proofErr w:type="spellEnd"/>
+            <w:r>
+              <w:rPr>
+                <w:sz w:val="18"/>
+                <w:szCs w:val="18"/>
+              </w:rPr>
+              <w:t>,</w:t>
+            </w:r>
+          </w:p>
+          <w:p>
+            <w:pPr>
+              <w:rPr>
+                <w:sz w:val="18"/>
+                <w:szCs w:val="18"/>
+              </w:rPr>
+            </w:pPr>
+            <w:proofErr w:type="spellStart"/>
+            <w:r>
+              <w:rPr>
+                <w:sz w:val="18"/>
+                <w:szCs w:val="18"/>
+              </w:rPr>
+              <w:t>TryMove_</w:t>
+            </w:r>
+            <w:r>
+              <w:rPr>
+                <w:sz w:val="18"/>
+                <w:szCs w:val="18"/>
+              </w:rPr>
+              <w:t>King</w:t>
+            </w:r>
+            <w:r>
+              <w:rPr>
+                <w:sz w:val="18"/>
+                <w:szCs w:val="18"/>
+              </w:rPr>
+              <w:t>_SuccesfulMove_ReturnsSuccess</w:t>
+            </w:r>
+            <w:proofErr w:type="spellEnd"/>
+          </w:p>
+          <w:p>
+            <w:pPr>
+              <w:rPr>
+                <w:sz w:val="18"/>
+                <w:szCs w:val="18"/>
+              </w:rPr>
+            </w:pPr>
+          </w:p>
+        </w:tc>
+        <w:tc>
+          <w:tcPr>
+            <w:tcW w:w="2016" w:type="dxa"/>
+          </w:tcPr>
+          <w:p>
+            <w:pPr>
+              <w:rPr>
+                <w:sz w:val="18"/>
+                <w:szCs w:val="18"/>
+              </w:rPr>
+            </w:pPr>
+            <w:r>
+              <w:rPr>
+                <w:sz w:val="18"/>
+                <w:szCs w:val="18"/>
+              </w:rPr>
+              <w:t>Success</w:t>
+            </w:r>
+          </w:p>
+          <w:p>
+            <w:pPr>
+              <w:rPr>
+                <w:sz w:val="18"/>
+                <w:szCs w:val="18"/>
+              </w:rPr>
+            </w:pPr>
+          </w:p>
+          <w:p>
+            <w:pPr>
+              <w:rPr>
+                <w:sz w:val="18"/>
+                <w:szCs w:val="18"/>
+              </w:rPr>
+            </w:pPr>
+            <w:r>
+              <w:rPr>
+                <w:sz w:val="18"/>
+                <w:szCs w:val="18"/>
+              </w:rPr>
+              <w:t xml:space="preserve">Current position updated to </w:t>
+            </w:r>
+            <w:r>
+              <w:rPr>
+                <w:sz w:val="18"/>
+                <w:szCs w:val="18"/>
+              </w:rPr>
+              <w:t>new chess piece position</w:t>
+            </w:r>
+          </w:p>
+        </w:tc>
+        <w:tc>
+          <w:tcPr>
+            <w:tcW w:w="799" w:type="dxa"/>
+          </w:tcPr>
+          <w:p>
+            <w:r>
+              <w:t>Pass</w:t>
+            </w:r>
+          </w:p>
         </w:tc>
       </w:tr>
     </w:tbl>
@@ -1328,239 +3548,7 @@
         <w:pStyle w:val="Heading2"/>
       </w:pPr>
       <w:r>
-        <w:t>Principal workflow evidence</w:t>
-      </w:r>
-    </w:p>
-    <w:tbl>
-      <w:tblPr>
-        <w:tblStyle w:val="TableGrid"/>
-        <w:tblW w:w="0" w:type="auto"/>
-        <w:tblLook w:val="04A0" w:firstRow="1" w:lastRow="0" w:firstColumn="1" w:lastColumn="0" w:noHBand="0" w:noVBand="1"/>
-      </w:tblPr>
-      <w:tblGrid>
-        <w:gridCol w:w="3005"/>
-        <w:gridCol w:w="3005"/>
-        <w:gridCol w:w="3006"/>
-      </w:tblGrid>
-      <w:tr>
-        <w:tc>
-          <w:tcPr>
-            <w:tcW w:w="3005" w:type="dxa"/>
-          </w:tcPr>
-          <w:p>
-            <w:pPr>
-              <w:rPr>
-                <w:b/>
-                <w:bCs/>
-              </w:rPr>
-            </w:pPr>
-            <w:r>
-              <w:rPr>
-                <w:b/>
-                <w:bCs/>
-              </w:rPr>
-              <w:t>Requirement</w:t>
-            </w:r>
-          </w:p>
-        </w:tc>
-        <w:tc>
-          <w:tcPr>
-            <w:tcW w:w="3005" w:type="dxa"/>
-          </w:tcPr>
-          <w:p>
-            <w:pPr>
-              <w:rPr>
-                <w:b/>
-                <w:bCs/>
-              </w:rPr>
-            </w:pPr>
-            <w:r>
-              <w:rPr>
-                <w:b/>
-                <w:bCs/>
-              </w:rPr>
-              <w:t>Evidence Location</w:t>
-            </w:r>
-          </w:p>
-        </w:tc>
-        <w:tc>
-          <w:tcPr>
-            <w:tcW w:w="3006" w:type="dxa"/>
-          </w:tcPr>
-          <w:p>
-            <w:pPr>
-              <w:rPr>
-                <w:b/>
-                <w:bCs/>
-              </w:rPr>
-            </w:pPr>
-            <w:r>
-              <w:rPr>
-                <w:b/>
-                <w:bCs/>
-              </w:rPr>
-              <w:t>What this evidence proves</w:t>
-            </w:r>
-          </w:p>
-        </w:tc>
-      </w:tr>
-      <w:tr>
-        <w:tc>
-          <w:tcPr>
-            <w:tcW w:w="3005" w:type="dxa"/>
-          </w:tcPr>
-          <w:p/>
-        </w:tc>
-        <w:tc>
-          <w:tcPr>
-            <w:tcW w:w="3005" w:type="dxa"/>
-          </w:tcPr>
-          <w:p/>
-        </w:tc>
-        <w:tc>
-          <w:tcPr>
-            <w:tcW w:w="3006" w:type="dxa"/>
-          </w:tcPr>
-          <w:p/>
-        </w:tc>
-      </w:tr>
-    </w:tbl>
-    <w:p/>
-    <w:p>
-      <w:pPr>
-        <w:pStyle w:val="Heading2"/>
-      </w:pPr>
-      <w:r>
-        <w:t>Automated testing evidence</w:t>
-      </w:r>
-    </w:p>
-    <w:tbl>
-      <w:tblPr>
-        <w:tblStyle w:val="TableGrid"/>
-        <w:tblW w:w="0" w:type="auto"/>
-        <w:tblLook w:val="04A0" w:firstRow="1" w:lastRow="0" w:firstColumn="1" w:lastColumn="0" w:noHBand="0" w:noVBand="1"/>
-      </w:tblPr>
-      <w:tblGrid>
-        <w:gridCol w:w="2254"/>
-        <w:gridCol w:w="2254"/>
-        <w:gridCol w:w="2254"/>
-        <w:gridCol w:w="2254"/>
-      </w:tblGrid>
-      <w:tr>
-        <w:tc>
-          <w:tcPr>
-            <w:tcW w:w="2254" w:type="dxa"/>
-          </w:tcPr>
-          <w:p>
-            <w:pPr>
-              <w:rPr>
-                <w:b/>
-                <w:bCs/>
-              </w:rPr>
-            </w:pPr>
-            <w:r>
-              <w:rPr>
-                <w:b/>
-                <w:bCs/>
-              </w:rPr>
-              <w:t>Risk/Requirement</w:t>
-            </w:r>
-          </w:p>
-        </w:tc>
-        <w:tc>
-          <w:tcPr>
-            <w:tcW w:w="2254" w:type="dxa"/>
-          </w:tcPr>
-          <w:p>
-            <w:pPr>
-              <w:rPr>
-                <w:b/>
-                <w:bCs/>
-              </w:rPr>
-            </w:pPr>
-            <w:r>
-              <w:rPr>
-                <w:b/>
-                <w:bCs/>
-              </w:rPr>
-              <w:t>Selected test</w:t>
-            </w:r>
-          </w:p>
-        </w:tc>
-        <w:tc>
-          <w:tcPr>
-            <w:tcW w:w="2254" w:type="dxa"/>
-          </w:tcPr>
-          <w:p>
-            <w:pPr>
-              <w:rPr>
-                <w:b/>
-                <w:bCs/>
-              </w:rPr>
-            </w:pPr>
-            <w:r>
-              <w:rPr>
-                <w:b/>
-                <w:bCs/>
-              </w:rPr>
-              <w:t>Expected result</w:t>
-            </w:r>
-          </w:p>
-        </w:tc>
-        <w:tc>
-          <w:tcPr>
-            <w:tcW w:w="2254" w:type="dxa"/>
-          </w:tcPr>
-          <w:p>
-            <w:pPr>
-              <w:rPr>
-                <w:b/>
-                <w:bCs/>
-              </w:rPr>
-            </w:pPr>
-            <w:r>
-              <w:rPr>
-                <w:b/>
-                <w:bCs/>
-              </w:rPr>
-              <w:t>Run result</w:t>
-            </w:r>
-          </w:p>
-        </w:tc>
-      </w:tr>
-      <w:tr>
-        <w:tc>
-          <w:tcPr>
-            <w:tcW w:w="2254" w:type="dxa"/>
-          </w:tcPr>
-          <w:p/>
-        </w:tc>
-        <w:tc>
-          <w:tcPr>
-            <w:tcW w:w="2254" w:type="dxa"/>
-          </w:tcPr>
-          <w:p/>
-        </w:tc>
-        <w:tc>
-          <w:tcPr>
-            <w:tcW w:w="2254" w:type="dxa"/>
-          </w:tcPr>
-          <w:p/>
-        </w:tc>
-        <w:tc>
-          <w:tcPr>
-            <w:tcW w:w="2254" w:type="dxa"/>
-          </w:tcPr>
-          <w:p/>
-        </w:tc>
-      </w:tr>
-    </w:tbl>
-    <w:p/>
-    <w:p>
-      <w:pPr>
-        <w:pStyle w:val="Heading2"/>
-      </w:pPr>
-      <w:r>
+        <w:lastRenderedPageBreak/>
         <w:t>Code quality and one design decision</w:t>
       </w:r>
     </w:p>
@@ -1571,10 +3559,10 @@
         <w:tblLook w:val="04A0" w:firstRow="1" w:lastRow="0" w:firstColumn="1" w:lastColumn="0" w:noHBand="0" w:noVBand="1"/>
       </w:tblPr>
       <w:tblGrid>
-        <w:gridCol w:w="2254"/>
-        <w:gridCol w:w="2254"/>
-        <w:gridCol w:w="2254"/>
-        <w:gridCol w:w="2254"/>
+        <w:gridCol w:w="2243"/>
+        <w:gridCol w:w="2289"/>
+        <w:gridCol w:w="2239"/>
+        <w:gridCol w:w="2245"/>
       </w:tblGrid>
       <w:tr>
         <w:tc>
@@ -1663,25 +3651,72 @@
           <w:tcPr>
             <w:tcW w:w="2254" w:type="dxa"/>
           </w:tcPr>
-          <w:p/>
+          <w:p>
+            <w:r>
+              <w:t>Handling custom piece positions for testing purposes (</w:t>
+            </w:r>
+            <w:proofErr w:type="spellStart"/>
+            <w:r>
+              <w:t>eg.</w:t>
+            </w:r>
+            <w:proofErr w:type="spellEnd"/>
+            <w:r>
+              <w:t xml:space="preserve"> Bishop </w:t>
+            </w:r>
+            <w:proofErr w:type="spellStart"/>
+            <w:r>
+              <w:t>PathBlocked</w:t>
+            </w:r>
+            <w:proofErr w:type="spellEnd"/>
+            <w:r>
+              <w:t>)</w:t>
+            </w:r>
+          </w:p>
         </w:tc>
         <w:tc>
           <w:tcPr>
             <w:tcW w:w="2254" w:type="dxa"/>
           </w:tcPr>
-          <w:p/>
+          <w:p>
+            <w:r>
+              <w:t xml:space="preserve">Have two separate constructors, one that uses default values in </w:t>
+            </w:r>
+            <w:proofErr w:type="spellStart"/>
+            <w:r>
+              <w:t>ReferenceBoardData</w:t>
+            </w:r>
+            <w:proofErr w:type="spellEnd"/>
+            <w:r>
+              <w:t>, and a separate constructor that uses custom chess piece positions when provided.</w:t>
+            </w:r>
+          </w:p>
         </w:tc>
         <w:tc>
           <w:tcPr>
             <w:tcW w:w="2254" w:type="dxa"/>
           </w:tcPr>
-          <w:p/>
+          <w:p>
+            <w:r>
+              <w:t>Slightly less efficient code, custom constructor only accepts chess piece positions and not other custom variables like gameboard size.</w:t>
+            </w:r>
+          </w:p>
         </w:tc>
         <w:tc>
           <w:tcPr>
             <w:tcW w:w="2254" w:type="dxa"/>
           </w:tcPr>
-          <w:p/>
+          <w:p>
+            <w:proofErr w:type="spellStart"/>
+            <w:r>
+              <w:t>GamePlayer.cs</w:t>
+            </w:r>
+            <w:proofErr w:type="spellEnd"/>
+          </w:p>
+          <w:p>
+            <w:r>
+              <w:t>Line 53 - 69</w:t>
+            </w:r>
+          </w:p>
         </w:tc>
       </w:tr>
     </w:tbl>
@@ -1701,13 +3736,13 @@
         <w:tblLook w:val="04A0" w:firstRow="1" w:lastRow="0" w:firstColumn="1" w:lastColumn="0" w:noHBand="0" w:noVBand="1"/>
       </w:tblPr>
       <w:tblGrid>
-        <w:gridCol w:w="4508"/>
-        <w:gridCol w:w="4508"/>
+        <w:gridCol w:w="1961"/>
+        <w:gridCol w:w="7055"/>
       </w:tblGrid>
       <w:tr>
         <w:tc>
           <w:tcPr>
-            <w:tcW w:w="4508" w:type="dxa"/>
+            <w:tcW w:w="2122" w:type="dxa"/>
           </w:tcPr>
           <w:p>
             <w:pPr>
@@ -1727,7 +3762,7 @@
         </w:tc>
         <w:tc>
           <w:tcPr>
-            <w:tcW w:w="4508" w:type="dxa"/>
+            <w:tcW w:w="6894" w:type="dxa"/>
           </w:tcPr>
           <w:p>
             <w:pPr>
@@ -1749,7 +3784,7 @@
       <w:tr>
         <w:tc>
           <w:tcPr>
-            <w:tcW w:w="4508" w:type="dxa"/>
+            <w:tcW w:w="2122" w:type="dxa"/>
           </w:tcPr>
           <w:p>
             <w:r>
@@ -1759,19 +3794,24 @@
         </w:tc>
         <w:tc>
           <w:tcPr>
-            <w:tcW w:w="4508" w:type="dxa"/>
-          </w:tcPr>
-          <w:p>
-            <w:r>
-              <w:t>9.0.316, selected by global.json</w:t>
-            </w:r>
+            <w:tcW w:w="6894" w:type="dxa"/>
+          </w:tcPr>
+          <w:p>
+            <w:r>
+              <w:t xml:space="preserve">9.0.316, selected by </w:t>
+            </w:r>
+            <w:proofErr w:type="spellStart"/>
+            <w:r>
+              <w:t>global.json</w:t>
+            </w:r>
+            <w:proofErr w:type="spellEnd"/>
           </w:p>
         </w:tc>
       </w:tr>
       <w:tr>
         <w:tc>
           <w:tcPr>
-            <w:tcW w:w="4508" w:type="dxa"/>
+            <w:tcW w:w="2122" w:type="dxa"/>
           </w:tcPr>
           <w:p>
             <w:r>
@@ -1781,15 +3821,19 @@
         </w:tc>
         <w:tc>
           <w:tcPr>
-            <w:tcW w:w="4508" w:type="dxa"/>
-          </w:tcPr>
-          <w:p/>
+            <w:tcW w:w="6894" w:type="dxa"/>
+          </w:tcPr>
+          <w:p>
+            <w:r>
+              <w:t>Visual Studio 2022</w:t>
+            </w:r>
+          </w:p>
         </w:tc>
       </w:tr>
       <w:tr>
         <w:tc>
           <w:tcPr>
-            <w:tcW w:w="4508" w:type="dxa"/>
+            <w:tcW w:w="2122" w:type="dxa"/>
           </w:tcPr>
           <w:p>
             <w:r>
@@ -1799,7 +3843,7 @@
         </w:tc>
         <w:tc>
           <w:tcPr>
-            <w:tcW w:w="4508" w:type="dxa"/>
+            <w:tcW w:w="6894" w:type="dxa"/>
           </w:tcPr>
           <w:p>
             <w:pPr>
@@ -1858,7 +3902,23 @@
                 <w:sz w:val="16"/>
                 <w:szCs w:val="16"/>
               </w:rPr>
-              <w:t>dotnet run --project src/BCIT615.Assessment1.GamePlayer.App</w:t>
+              <w:t xml:space="preserve">dotnet run --project </w:t>
+            </w:r>
+            <w:proofErr w:type="spellStart"/>
+            <w:r>
+              <w:rPr>
+                <w:sz w:val="16"/>
+                <w:szCs w:val="16"/>
+              </w:rPr>
+              <w:t>src</w:t>
+            </w:r>
+            <w:proofErr w:type="spellEnd"/>
+            <w:r>
+              <w:rPr>
+                <w:sz w:val="16"/>
+                <w:szCs w:val="16"/>
+              </w:rPr>
+              <w:t>/BCIT615.Assessment1.GamePlayer.App</w:t>
             </w:r>
           </w:p>
         </w:tc>
@@ -1866,7 +3926,7 @@
       <w:tr>
         <w:tc>
           <w:tcPr>
-            <w:tcW w:w="4508" w:type="dxa"/>
+            <w:tcW w:w="2122" w:type="dxa"/>
           </w:tcPr>
           <w:p>
             <w:r>
@@ -1876,15 +3936,112 @@
         </w:tc>
         <w:tc>
           <w:tcPr>
-            <w:tcW w:w="4508" w:type="dxa"/>
-          </w:tcPr>
-          <w:p/>
+            <w:tcW w:w="6894" w:type="dxa"/>
+          </w:tcPr>
+          <w:p>
+            <w:pPr>
+              <w:rPr>
+                <w:sz w:val="16"/>
+                <w:szCs w:val="16"/>
+              </w:rPr>
+            </w:pPr>
+            <w:r>
+              <w:rPr>
+                <w:sz w:val="16"/>
+                <w:szCs w:val="16"/>
+              </w:rPr>
+              <w:t>BCIT615.Assessment1.GamePlayer.Contracts succeeded (4.2s) → src\BCIT615.Assessment1.GamePlayer.Contracts\bin\Debug\net9.0\BCIT615.Assessment1.GamePlayer.Contracts.dll</w:t>
+            </w:r>
+          </w:p>
+          <w:p>
+            <w:pPr>
+              <w:rPr>
+                <w:sz w:val="16"/>
+                <w:szCs w:val="16"/>
+              </w:rPr>
+            </w:pPr>
+            <w:r>
+              <w:rPr>
+                <w:sz w:val="16"/>
+                <w:szCs w:val="16"/>
+              </w:rPr>
+              <w:t xml:space="preserve">  BCIT615.Assessment1.GamePlayer.Model succeeded (3.1s) → src\BCIT615.Assessment1.GamePlayer.Model\bin\Debug\net9.0\BCIT615.Assessment1.GamePlayer.Model.dll</w:t>
+            </w:r>
+          </w:p>
+          <w:p>
+            <w:pPr>
+              <w:rPr>
+                <w:sz w:val="16"/>
+                <w:szCs w:val="16"/>
+              </w:rPr>
+            </w:pPr>
+            <w:r>
+              <w:rPr>
+                <w:sz w:val="16"/>
+                <w:szCs w:val="16"/>
+              </w:rPr>
+              <w:t xml:space="preserve">  BCIT615.Assessment1.GamePlayer.ContractTests succeeded (1.0s) → tests\BCIT615.Assessment1.GamePlayer.ContractTests\bin\Debug\net9.0\BCIT615.Assessment1.GamePlayer.ContractTests.dll</w:t>
+            </w:r>
+          </w:p>
+          <w:p>
+            <w:pPr>
+              <w:rPr>
+                <w:sz w:val="16"/>
+                <w:szCs w:val="16"/>
+              </w:rPr>
+            </w:pPr>
+            <w:r>
+              <w:rPr>
+                <w:sz w:val="16"/>
+                <w:szCs w:val="16"/>
+              </w:rPr>
+              <w:t xml:space="preserve">  BCIT615.Assessment1.GamePlayer.App succeeded (1.0s) → src\BCIT615.Assessment1.GamePlayer.App\bin\Debug\net9.0\BCIT615.Assessment1.GamePlayer.App.dll</w:t>
+            </w:r>
+          </w:p>
+          <w:p>
+            <w:pPr>
+              <w:rPr>
+                <w:sz w:val="16"/>
+                <w:szCs w:val="16"/>
+              </w:rPr>
+            </w:pPr>
+            <w:r>
+              <w:rPr>
+                <w:sz w:val="16"/>
+                <w:szCs w:val="16"/>
+              </w:rPr>
+              <w:t xml:space="preserve">  BCIT615.Assessment1.GamePlayer.ModelTests succeeded (1.0s) → tests\BCIT615.Assessment1.GamePlayer.ModelTests\bin\Debug\net9.0\BCIT615.Assessment1.GamePlayer.ModelTests.dll</w:t>
+            </w:r>
+          </w:p>
+          <w:p>
+            <w:pPr>
+              <w:rPr>
+                <w:sz w:val="16"/>
+                <w:szCs w:val="16"/>
+              </w:rPr>
+            </w:pPr>
+          </w:p>
+          <w:p>
+            <w:pPr>
+              <w:rPr>
+                <w:sz w:val="16"/>
+                <w:szCs w:val="16"/>
+              </w:rPr>
+            </w:pPr>
+            <w:r>
+              <w:rPr>
+                <w:sz w:val="16"/>
+                <w:szCs w:val="16"/>
+              </w:rPr>
+              <w:t>Build succeeded in 9.0s</w:t>
+            </w:r>
+          </w:p>
         </w:tc>
       </w:tr>
       <w:tr>
         <w:tc>
           <w:tcPr>
-            <w:tcW w:w="4508" w:type="dxa"/>
+            <w:tcW w:w="2122" w:type="dxa"/>
           </w:tcPr>
           <w:p>
             <w:r>
@@ -1894,15 +4051,79 @@
         </w:tc>
         <w:tc>
           <w:tcPr>
-            <w:tcW w:w="4508" w:type="dxa"/>
-          </w:tcPr>
-          <w:p/>
+            <w:tcW w:w="6894" w:type="dxa"/>
+          </w:tcPr>
+          <w:p>
+            <w:pPr>
+              <w:rPr>
+                <w:sz w:val="22"/>
+                <w:szCs w:val="22"/>
+              </w:rPr>
+            </w:pPr>
+            <w:r>
+              <w:t xml:space="preserve">  </w:t>
+            </w:r>
+            <w:r>
+              <w:rPr>
+                <w:sz w:val="22"/>
+                <w:szCs w:val="22"/>
+              </w:rPr>
+              <w:t>BCIT615.Assessment1.GamePlayer.ModelTests test succeeded (1.6s)</w:t>
+            </w:r>
+          </w:p>
+          <w:p>
+            <w:pPr>
+              <w:rPr>
+                <w:sz w:val="22"/>
+                <w:szCs w:val="22"/>
+              </w:rPr>
+            </w:pPr>
+            <w:r>
+              <w:rPr>
+                <w:sz w:val="22"/>
+                <w:szCs w:val="22"/>
+              </w:rPr>
+              <w:t xml:space="preserve">  BCIT615.Assessment1.GamePlayer.ContractTests test succeeded (1.6s)</w:t>
+            </w:r>
+          </w:p>
+          <w:p>
+            <w:pPr>
+              <w:rPr>
+                <w:sz w:val="22"/>
+                <w:szCs w:val="22"/>
+              </w:rPr>
+            </w:pPr>
+          </w:p>
+          <w:p>
+            <w:pPr>
+              <w:rPr>
+                <w:sz w:val="22"/>
+                <w:szCs w:val="22"/>
+              </w:rPr>
+            </w:pPr>
+            <w:r>
+              <w:rPr>
+                <w:sz w:val="22"/>
+                <w:szCs w:val="22"/>
+              </w:rPr>
+              <w:t>Test summary: total: 25, failed: 0, succeeded: 25, skipped: 0, duration: 1.7s</w:t>
+            </w:r>
+          </w:p>
+          <w:p>
+            <w:r>
+              <w:rPr>
+                <w:sz w:val="22"/>
+                <w:szCs w:val="22"/>
+              </w:rPr>
+              <w:t>Build succeeded in 2.1s</w:t>
+            </w:r>
+          </w:p>
         </w:tc>
       </w:tr>
       <w:tr>
         <w:tc>
           <w:tcPr>
-            <w:tcW w:w="4508" w:type="dxa"/>
+            <w:tcW w:w="2122" w:type="dxa"/>
           </w:tcPr>
           <w:p>
             <w:r>
@@ -1912,15 +4133,32 @@
         </w:tc>
         <w:tc>
           <w:tcPr>
-            <w:tcW w:w="4508" w:type="dxa"/>
-          </w:tcPr>
-          <w:p/>
+            <w:tcW w:w="6894" w:type="dxa"/>
+          </w:tcPr>
+          <w:p>
+            <w:r>
+              <w:t>BCIT615 Assessment 1 Game Player starter is ready.</w:t>
+            </w:r>
+          </w:p>
+          <w:p>
+            <w:r>
+              <w:t xml:space="preserve">Implement </w:t>
+            </w:r>
+            <w:proofErr w:type="spellStart"/>
+            <w:r>
+              <w:t>IGamePlayer</w:t>
+            </w:r>
+            <w:proofErr w:type="spellEnd"/>
+            <w:r>
+              <w:t xml:space="preserve"> in learner-owned Model files.</w:t>
+            </w:r>
+          </w:p>
         </w:tc>
       </w:tr>
       <w:tr>
         <w:tc>
           <w:tcPr>
-            <w:tcW w:w="4508" w:type="dxa"/>
+            <w:tcW w:w="2122" w:type="dxa"/>
           </w:tcPr>
           <w:p>
             <w:r>
@@ -1930,17 +4168,17 @@
         </w:tc>
         <w:tc>
           <w:tcPr>
-            <w:tcW w:w="4508" w:type="dxa"/>
-          </w:tcPr>
-          <w:p/>
+            <w:tcW w:w="6894" w:type="dxa"/>
+          </w:tcPr>
+          <w:p>
+            <w:r>
+              <w:t>None</w:t>
+            </w:r>
+          </w:p>
         </w:tc>
       </w:tr>
     </w:tbl>
-    <w:p>
-      <w:pPr>
-        <w:pStyle w:val="Heading2"/>
-      </w:pPr>
-    </w:p>
+    <w:p/>
     <w:p>
       <w:pPr>
         <w:rPr>
@@ -2025,14 +4263,27 @@
       <w:r>
         <w:t xml:space="preserve">Figure </w:t>
       </w:r>
-      <w:fldSimple w:instr=" SEQ Figure \* ARABIC ">
-        <w:r>
-          <w:rPr>
-            <w:noProof/>
-          </w:rPr>
-          <w:t>1</w:t>
-        </w:r>
-      </w:fldSimple>
+      <w:r>
+        <w:fldChar w:fldCharType="begin"/>
+      </w:r>
+      <w:r>
+        <w:instrText xml:space="preserve"> SEQ Figure \* ARABIC </w:instrText>
+      </w:r>
+      <w:r>
+        <w:fldChar w:fldCharType="separate"/>
+      </w:r>
+      <w:r>
+        <w:rPr>
+          <w:noProof/>
+        </w:rPr>
+        <w:t>1</w:t>
+      </w:r>
+      <w:r>
+        <w:rPr>
+          <w:noProof/>
+        </w:rPr>
+        <w:fldChar w:fldCharType="end"/>
+      </w:r>
       <w:r>
         <w:t xml:space="preserve"> Screenshot of GitHub version history, more details such as </w:t>
       </w:r>
@@ -2712,7 +4963,6 @@
   <w:style w:type="character" w:default="1" w:styleId="DefaultParagraphFont">
     <w:name w:val="Default Paragraph Font"/>
     <w:uiPriority w:val="1"/>
-    <w:semiHidden/>
     <w:unhideWhenUsed/>
   </w:style>
   <w:style w:type="table" w:default="1" w:styleId="TableNormal">
@@ -3089,6 +5339,36 @@
       <w:szCs w:val="18"/>
     </w:rPr>
   </w:style>
+  <w:style w:type="paragraph" w:styleId="HTMLPreformatted">
+    <w:name w:val="HTML Preformatted"/>
+    <w:basedOn w:val="Normal"/>
+    <w:link w:val="HTMLPreformattedChar"/>
+    <w:uiPriority w:val="99"/>
+    <w:semiHidden/>
+    <w:unhideWhenUsed/>
+    <w:rsid w:val="00E70805"/>
+    <w:pPr>
+      <w:spacing w:after="0" w:line="240" w:lineRule="auto"/>
+    </w:pPr>
+    <w:rPr>
+      <w:rFonts w:ascii="Consolas" w:hAnsi="Consolas"/>
+      <w:sz w:val="20"/>
+      <w:szCs w:val="20"/>
+    </w:rPr>
+  </w:style>
+  <w:style w:type="character" w:customStyle="1" w:styleId="HTMLPreformattedChar">
+    <w:name w:val="HTML Preformatted Char"/>
+    <w:basedOn w:val="DefaultParagraphFont"/>
+    <w:link w:val="HTMLPreformatted"/>
+    <w:uiPriority w:val="99"/>
+    <w:semiHidden/>
+    <w:rsid w:val="00E70805"/>
+    <w:rPr>
+      <w:rFonts w:ascii="Consolas" w:hAnsi="Consolas" w:cs="Times New Roman"/>
+      <w:sz w:val="20"/>
+      <w:szCs w:val="20"/>
+    </w:rPr>
+  </w:style>
 </w:styles>
 </file>
 

</xml_diff>

<commit_message>
ChessMaze v09.14 - Completed final solution
</commit_message>
<xml_diff>
--- a/docs/EvidencePack.docx
+++ b/docs/EvidencePack.docx
@@ -257,13 +257,8 @@
             <w:tcW w:w="4343" w:type="dxa"/>
           </w:tcPr>
           <w:p>
-            <w:proofErr w:type="spellStart"/>
-            <w:r>
-              <w:t>GamePlayer.cs</w:t>
-            </w:r>
-            <w:proofErr w:type="spellEnd"/>
-            <w:r>
-              <w:t xml:space="preserve"> line 36 - 69</w:t>
+            <w:r>
+              <w:t>GamePlayer.cs line 36 - 69</w:t>
             </w:r>
           </w:p>
         </w:tc>
@@ -294,13 +289,8 @@
             <w:tcW w:w="4343" w:type="dxa"/>
           </w:tcPr>
           <w:p>
-            <w:proofErr w:type="spellStart"/>
-            <w:r>
-              <w:t>GamePlayer.cs</w:t>
-            </w:r>
-            <w:proofErr w:type="spellEnd"/>
-            <w:r>
-              <w:t xml:space="preserve"> line 229 – 234</w:t>
+            <w:r>
+              <w:t>GamePlayer.cs line 229 – 234</w:t>
             </w:r>
           </w:p>
         </w:tc>
@@ -331,13 +321,8 @@
             <w:tcW w:w="4343" w:type="dxa"/>
           </w:tcPr>
           <w:p>
-            <w:proofErr w:type="spellStart"/>
-            <w:r>
-              <w:t>GamePlayer.cs</w:t>
-            </w:r>
-            <w:proofErr w:type="spellEnd"/>
-            <w:r>
-              <w:t xml:space="preserve"> line 101 - 127</w:t>
+            <w:r>
+              <w:t>GamePlayer.cs line 101 - 127</w:t>
             </w:r>
           </w:p>
         </w:tc>
@@ -368,13 +353,8 @@
             <w:tcW w:w="4343" w:type="dxa"/>
           </w:tcPr>
           <w:p>
-            <w:proofErr w:type="spellStart"/>
-            <w:r>
-              <w:t>GamePlayer.cs</w:t>
-            </w:r>
-            <w:proofErr w:type="spellEnd"/>
-            <w:r>
-              <w:t xml:space="preserve"> line 129 – 155 </w:t>
+            <w:r>
+              <w:t xml:space="preserve">GamePlayer.cs line 129 – 155 </w:t>
             </w:r>
           </w:p>
         </w:tc>
@@ -405,13 +385,8 @@
             <w:tcW w:w="4343" w:type="dxa"/>
           </w:tcPr>
           <w:p>
-            <w:proofErr w:type="spellStart"/>
-            <w:r>
-              <w:t>GamePlayer.cs</w:t>
-            </w:r>
-            <w:proofErr w:type="spellEnd"/>
-            <w:r>
-              <w:t xml:space="preserve"> line 158 – 171</w:t>
+            <w:r>
+              <w:t>GamePlayer.cs line 158 – 171</w:t>
             </w:r>
           </w:p>
         </w:tc>
@@ -442,13 +417,8 @@
             <w:tcW w:w="4343" w:type="dxa"/>
           </w:tcPr>
           <w:p>
-            <w:proofErr w:type="spellStart"/>
-            <w:r>
-              <w:t>GamePlayer.cs</w:t>
-            </w:r>
-            <w:proofErr w:type="spellEnd"/>
-            <w:r>
-              <w:t xml:space="preserve"> line 173 – 185</w:t>
+            <w:r>
+              <w:t>GamePlayer.cs line 173 – 185</w:t>
             </w:r>
           </w:p>
         </w:tc>
@@ -479,13 +449,8 @@
             <w:tcW w:w="4343" w:type="dxa"/>
           </w:tcPr>
           <w:p>
-            <w:proofErr w:type="spellStart"/>
-            <w:r>
-              <w:t>GamePlayer.cs</w:t>
-            </w:r>
-            <w:proofErr w:type="spellEnd"/>
-            <w:r>
-              <w:t xml:space="preserve"> line </w:t>
+            <w:r>
+              <w:t xml:space="preserve">GamePlayer.cs line </w:t>
             </w:r>
             <w:r>
               <w:t>85 – 95 and 190-193</w:t>
@@ -519,13 +484,8 @@
             <w:tcW w:w="4343" w:type="dxa"/>
           </w:tcPr>
           <w:p>
-            <w:proofErr w:type="spellStart"/>
-            <w:r>
-              <w:t>GamePlayer.cs</w:t>
-            </w:r>
-            <w:proofErr w:type="spellEnd"/>
-            <w:r>
-              <w:t xml:space="preserve"> line 206-224</w:t>
+            <w:r>
+              <w:t>GamePlayer.cs line 206-224</w:t>
             </w:r>
           </w:p>
         </w:tc>
@@ -706,13 +666,8 @@
             <w:tcW w:w="1842" w:type="dxa"/>
           </w:tcPr>
           <w:p>
-            <w:proofErr w:type="spellStart"/>
-            <w:r>
-              <w:t>GamePlayer.cs</w:t>
-            </w:r>
-            <w:proofErr w:type="spellEnd"/>
-            <w:r>
-              <w:t xml:space="preserve"> line 36 - 69</w:t>
+            <w:r>
+              <w:t>GamePlayer.cs line 36 - 69</w:t>
             </w:r>
           </w:p>
         </w:tc>
@@ -721,13 +676,8 @@
             <w:tcW w:w="2784" w:type="dxa"/>
           </w:tcPr>
           <w:p>
-            <w:proofErr w:type="spellStart"/>
-            <w:r>
-              <w:t>GamePlayerTests.cs</w:t>
-            </w:r>
-            <w:proofErr w:type="spellEnd"/>
-            <w:r>
-              <w:t xml:space="preserve"> line 11 - 49</w:t>
+            <w:r>
+              <w:t>GamePlayerTests.cs line 11 - 49</w:t>
             </w:r>
           </w:p>
         </w:tc>
@@ -768,13 +718,8 @@
             <w:tcW w:w="1842" w:type="dxa"/>
           </w:tcPr>
           <w:p>
-            <w:proofErr w:type="spellStart"/>
-            <w:r>
-              <w:t>GamePlayer.cs</w:t>
-            </w:r>
-            <w:proofErr w:type="spellEnd"/>
-            <w:r>
-              <w:t xml:space="preserve"> line 229 – 234</w:t>
+            <w:r>
+              <w:t>GamePlayer.cs line 229 – 234</w:t>
             </w:r>
           </w:p>
         </w:tc>
@@ -783,11 +728,9 @@
             <w:tcW w:w="2784" w:type="dxa"/>
           </w:tcPr>
           <w:p>
-            <w:proofErr w:type="spellStart"/>
             <w:r>
               <w:t>GamePlayerTests.cs</w:t>
             </w:r>
-            <w:proofErr w:type="spellEnd"/>
           </w:p>
           <w:p>
             <w:r>
@@ -830,471 +773,482 @@
                 <w:sz w:val="22"/>
                 <w:szCs w:val="22"/>
               </w:rPr>
-              <w:t xml:space="preserve">ny invalid movements that apply to all pieces such as </w:t>
-            </w:r>
-            <w:proofErr w:type="spellStart"/>
-            <w:r>
+              <w:t>ny invalid movements that apply to all pieces such as OutOfBounds, InvalidDestination or GameAlreadyCompleted</w:t>
+            </w:r>
+          </w:p>
+        </w:tc>
+        <w:tc>
+          <w:tcPr>
+            <w:tcW w:w="1842" w:type="dxa"/>
+          </w:tcPr>
+          <w:p>
+            <w:r>
+              <w:t>Gameplayer.cs</w:t>
+            </w:r>
+          </w:p>
+          <w:p>
+            <w:r>
+              <w:t>Line 85 – 95,</w:t>
+            </w:r>
+          </w:p>
+          <w:p>
+            <w:r>
+              <w:t>Line 190 – 193</w:t>
+            </w:r>
+          </w:p>
+        </w:tc>
+        <w:tc>
+          <w:tcPr>
+            <w:tcW w:w="2784" w:type="dxa"/>
+          </w:tcPr>
+          <w:p>
+            <w:r>
+              <w:t>TryMoveAllPiecesTests.cs</w:t>
+            </w:r>
+          </w:p>
+          <w:p>
+            <w:r>
+              <w:t>Line 1 - 44</w:t>
+            </w:r>
+          </w:p>
+        </w:tc>
+      </w:tr>
+      <w:tr>
+        <w:tc>
+          <w:tcPr>
+            <w:tcW w:w="1592" w:type="dxa"/>
+          </w:tcPr>
+          <w:p>
+            <w:r>
+              <w:t>Rook move conditions</w:t>
+            </w:r>
+          </w:p>
+        </w:tc>
+        <w:tc>
+          <w:tcPr>
+            <w:tcW w:w="2798" w:type="dxa"/>
+          </w:tcPr>
+          <w:p>
+            <w:pPr>
               <w:rPr>
                 <w:sz w:val="22"/>
                 <w:szCs w:val="22"/>
               </w:rPr>
-              <w:t>OutOfBounds</w:t>
-            </w:r>
-            <w:proofErr w:type="spellEnd"/>
+            </w:pPr>
             <w:r>
               <w:rPr>
                 <w:sz w:val="22"/>
                 <w:szCs w:val="22"/>
               </w:rPr>
-              <w:t xml:space="preserve">, </w:t>
-            </w:r>
-            <w:proofErr w:type="spellStart"/>
+              <w:t>Block a</w:t>
+            </w:r>
             <w:r>
               <w:rPr>
                 <w:sz w:val="22"/>
                 <w:szCs w:val="22"/>
               </w:rPr>
-              <w:t>InvalidDestination</w:t>
-            </w:r>
-            <w:proofErr w:type="spellEnd"/>
+              <w:t xml:space="preserve">ny </w:t>
+            </w:r>
             <w:r>
               <w:rPr>
                 <w:sz w:val="22"/>
                 <w:szCs w:val="22"/>
               </w:rPr>
-              <w:t xml:space="preserve"> or </w:t>
-            </w:r>
-            <w:proofErr w:type="spellStart"/>
+              <w:t xml:space="preserve">invalid movements that apply specifically to the rook pieces (destinations that are not vertically or horizontally aligned to the </w:t>
+            </w:r>
             <w:r>
               <w:rPr>
                 <w:sz w:val="22"/>
                 <w:szCs w:val="22"/>
               </w:rPr>
-              <w:t>GameAlreadyCompleted</w:t>
-            </w:r>
-            <w:proofErr w:type="spellEnd"/>
-          </w:p>
-        </w:tc>
-        <w:tc>
-          <w:tcPr>
-            <w:tcW w:w="1842" w:type="dxa"/>
-          </w:tcPr>
-          <w:p>
-            <w:proofErr w:type="spellStart"/>
-            <w:r>
-              <w:t>Gameplayer.cs</w:t>
-            </w:r>
-            <w:proofErr w:type="spellEnd"/>
-          </w:p>
-          <w:p>
-            <w:r>
-              <w:t>Line 85 – 95,</w:t>
-            </w:r>
-          </w:p>
-          <w:p>
-            <w:r>
-              <w:t>Line 190 – 193</w:t>
-            </w:r>
-          </w:p>
-        </w:tc>
-        <w:tc>
-          <w:tcPr>
-            <w:tcW w:w="2784" w:type="dxa"/>
-          </w:tcPr>
-          <w:p>
-            <w:proofErr w:type="spellStart"/>
-            <w:r>
-              <w:t>TryMoveAllPiecesTests.cs</w:t>
-            </w:r>
-            <w:proofErr w:type="spellEnd"/>
-          </w:p>
-          <w:p>
-            <w:r>
-              <w:t>Line 1 - 44</w:t>
-            </w:r>
-          </w:p>
-        </w:tc>
-      </w:tr>
-      <w:tr>
-        <w:tc>
-          <w:tcPr>
-            <w:tcW w:w="1592" w:type="dxa"/>
-          </w:tcPr>
-          <w:p>
-            <w:r>
-              <w:t>Rook move conditions</w:t>
-            </w:r>
-          </w:p>
-        </w:tc>
-        <w:tc>
-          <w:tcPr>
-            <w:tcW w:w="2798" w:type="dxa"/>
-          </w:tcPr>
-          <w:p>
-            <w:pPr>
+              <w:t>current</w:t>
+            </w:r>
+            <w:r>
               <w:rPr>
                 <w:sz w:val="22"/>
                 <w:szCs w:val="22"/>
               </w:rPr>
-            </w:pPr>
-            <w:r>
+              <w:t xml:space="preserve"> position)</w:t>
+            </w:r>
+          </w:p>
+        </w:tc>
+        <w:tc>
+          <w:tcPr>
+            <w:tcW w:w="1842" w:type="dxa"/>
+          </w:tcPr>
+          <w:p>
+            <w:r>
+              <w:t>GamePlayer.cs</w:t>
+            </w:r>
+          </w:p>
+          <w:p>
+            <w:r>
+              <w:t>Line 101 – 127</w:t>
+            </w:r>
+          </w:p>
+        </w:tc>
+        <w:tc>
+          <w:tcPr>
+            <w:tcW w:w="2784" w:type="dxa"/>
+          </w:tcPr>
+          <w:p>
+            <w:r>
+              <w:t>TryMoveRookTests.cs</w:t>
+            </w:r>
+          </w:p>
+          <w:p>
+            <w:r>
+              <w:t>Line 1 – 55</w:t>
+            </w:r>
+          </w:p>
+        </w:tc>
+      </w:tr>
+      <w:tr>
+        <w:tc>
+          <w:tcPr>
+            <w:tcW w:w="1592" w:type="dxa"/>
+          </w:tcPr>
+          <w:p>
+            <w:r>
+              <w:t>Bishop move conditions</w:t>
+            </w:r>
+          </w:p>
+        </w:tc>
+        <w:tc>
+          <w:tcPr>
+            <w:tcW w:w="2798" w:type="dxa"/>
+          </w:tcPr>
+          <w:p>
+            <w:pPr>
               <w:rPr>
                 <w:sz w:val="22"/>
                 <w:szCs w:val="22"/>
               </w:rPr>
-              <w:t>Block a</w:t>
-            </w:r>
+            </w:pPr>
             <w:r>
               <w:rPr>
                 <w:sz w:val="22"/>
                 <w:szCs w:val="22"/>
               </w:rPr>
-              <w:t xml:space="preserve">ny </w:t>
+              <w:t>Block a</w:t>
             </w:r>
             <w:r>
               <w:rPr>
                 <w:sz w:val="22"/>
                 <w:szCs w:val="22"/>
               </w:rPr>
-              <w:t xml:space="preserve">invalid movements that apply specifically to the rook pieces (destinations that are not vertically or horizontally aligned to the </w:t>
+              <w:t xml:space="preserve">ny </w:t>
             </w:r>
             <w:r>
               <w:rPr>
                 <w:sz w:val="22"/>
                 <w:szCs w:val="22"/>
               </w:rPr>
-              <w:t>current</w:t>
-            </w:r>
-            <w:r>
+              <w:t>invalid movements specific for bishop piece (destinations that are not diagonally aligned to the current position)</w:t>
+            </w:r>
+          </w:p>
+        </w:tc>
+        <w:tc>
+          <w:tcPr>
+            <w:tcW w:w="1842" w:type="dxa"/>
+          </w:tcPr>
+          <w:p>
+            <w:r>
+              <w:t>GamePlayer.cs</w:t>
+            </w:r>
+          </w:p>
+          <w:p>
+            <w:r>
+              <w:t>Line 129 - 155</w:t>
+            </w:r>
+          </w:p>
+        </w:tc>
+        <w:tc>
+          <w:tcPr>
+            <w:tcW w:w="2784" w:type="dxa"/>
+          </w:tcPr>
+          <w:p>
+            <w:r>
+              <w:t>TryMoveBishopTests.cs</w:t>
+            </w:r>
+          </w:p>
+          <w:p>
+            <w:r>
+              <w:t>Line 1 – 71</w:t>
+            </w:r>
+          </w:p>
+        </w:tc>
+      </w:tr>
+      <w:tr>
+        <w:tc>
+          <w:tcPr>
+            <w:tcW w:w="1592" w:type="dxa"/>
+          </w:tcPr>
+          <w:p>
+            <w:r>
+              <w:t>Knight move conditions</w:t>
+            </w:r>
+          </w:p>
+        </w:tc>
+        <w:tc>
+          <w:tcPr>
+            <w:tcW w:w="2798" w:type="dxa"/>
+          </w:tcPr>
+          <w:p>
+            <w:pPr>
               <w:rPr>
                 <w:sz w:val="22"/>
                 <w:szCs w:val="22"/>
               </w:rPr>
-              <w:t xml:space="preserve"> position)</w:t>
-            </w:r>
-          </w:p>
-        </w:tc>
-        <w:tc>
-          <w:tcPr>
-            <w:tcW w:w="1842" w:type="dxa"/>
-          </w:tcPr>
-          <w:p>
-            <w:proofErr w:type="spellStart"/>
-            <w:r>
-              <w:t>GamePlayer.cs</w:t>
-            </w:r>
-            <w:proofErr w:type="spellEnd"/>
-          </w:p>
-          <w:p>
-            <w:r>
-              <w:t>Line 101 – 127</w:t>
-            </w:r>
-          </w:p>
-        </w:tc>
-        <w:tc>
-          <w:tcPr>
-            <w:tcW w:w="2784" w:type="dxa"/>
-          </w:tcPr>
-          <w:p>
-            <w:proofErr w:type="spellStart"/>
-            <w:r>
-              <w:t>TryMoveRookTests.cs</w:t>
-            </w:r>
-            <w:proofErr w:type="spellEnd"/>
-          </w:p>
-          <w:p>
-            <w:r>
-              <w:t>Line 1 – 55</w:t>
-            </w:r>
-          </w:p>
-        </w:tc>
-      </w:tr>
-      <w:tr>
-        <w:tc>
-          <w:tcPr>
-            <w:tcW w:w="1592" w:type="dxa"/>
-          </w:tcPr>
-          <w:p>
-            <w:r>
-              <w:t>Bishop move conditions</w:t>
-            </w:r>
-          </w:p>
-        </w:tc>
-        <w:tc>
-          <w:tcPr>
-            <w:tcW w:w="2798" w:type="dxa"/>
-          </w:tcPr>
-          <w:p>
-            <w:pPr>
+            </w:pPr>
+            <w:r>
               <w:rPr>
                 <w:sz w:val="22"/>
                 <w:szCs w:val="22"/>
               </w:rPr>
-            </w:pPr>
+              <w:t>Block a</w:t>
+            </w:r>
             <w:r>
               <w:rPr>
                 <w:sz w:val="22"/>
                 <w:szCs w:val="22"/>
               </w:rPr>
-              <w:t>Block a</w:t>
+              <w:t xml:space="preserve">ny </w:t>
             </w:r>
             <w:r>
               <w:rPr>
                 <w:sz w:val="22"/>
                 <w:szCs w:val="22"/>
               </w:rPr>
-              <w:t xml:space="preserve">ny </w:t>
-            </w:r>
-            <w:r>
+              <w:t>invalid movements specific for bishop piece (destinations that are not 2 steps in one axis and 1 step on the other axis)</w:t>
+            </w:r>
+          </w:p>
+        </w:tc>
+        <w:tc>
+          <w:tcPr>
+            <w:tcW w:w="1842" w:type="dxa"/>
+          </w:tcPr>
+          <w:p>
+            <w:r>
+              <w:t>GamePlayer.cs</w:t>
+            </w:r>
+          </w:p>
+          <w:p>
+            <w:r>
+              <w:t>Line 158 – 171</w:t>
+            </w:r>
+          </w:p>
+        </w:tc>
+        <w:tc>
+          <w:tcPr>
+            <w:tcW w:w="2784" w:type="dxa"/>
+          </w:tcPr>
+          <w:p>
+            <w:r>
+              <w:t>TryMoveKnightTests.cs</w:t>
+            </w:r>
+          </w:p>
+          <w:p>
+            <w:r>
+              <w:t xml:space="preserve">Line 1 </w:t>
+            </w:r>
+            <w:r>
+              <w:t>–</w:t>
+            </w:r>
+            <w:r>
+              <w:t xml:space="preserve"> 58</w:t>
+            </w:r>
+          </w:p>
+        </w:tc>
+      </w:tr>
+      <w:tr>
+        <w:tc>
+          <w:tcPr>
+            <w:tcW w:w="1592" w:type="dxa"/>
+          </w:tcPr>
+          <w:p>
+            <w:r>
+              <w:t>King move conditions</w:t>
+            </w:r>
+          </w:p>
+        </w:tc>
+        <w:tc>
+          <w:tcPr>
+            <w:tcW w:w="2798" w:type="dxa"/>
+          </w:tcPr>
+          <w:p>
+            <w:pPr>
               <w:rPr>
                 <w:sz w:val="22"/>
                 <w:szCs w:val="22"/>
               </w:rPr>
-              <w:t>invalid movements specific for bishop piece (destinations that are not diagonally aligned to the current position)</w:t>
-            </w:r>
-          </w:p>
-        </w:tc>
-        <w:tc>
-          <w:tcPr>
-            <w:tcW w:w="1842" w:type="dxa"/>
-          </w:tcPr>
-          <w:p>
-            <w:proofErr w:type="spellStart"/>
-            <w:r>
-              <w:t>GamePlayer.cs</w:t>
-            </w:r>
-            <w:proofErr w:type="spellEnd"/>
-          </w:p>
-          <w:p>
-            <w:r>
-              <w:t>Line 129 - 155</w:t>
-            </w:r>
-          </w:p>
-        </w:tc>
-        <w:tc>
-          <w:tcPr>
-            <w:tcW w:w="2784" w:type="dxa"/>
-          </w:tcPr>
-          <w:p>
-            <w:proofErr w:type="spellStart"/>
-            <w:r>
-              <w:t>TryMoveBishopTests.cs</w:t>
-            </w:r>
-            <w:proofErr w:type="spellEnd"/>
-          </w:p>
-          <w:p>
-            <w:r>
-              <w:t>Line 1 – 71</w:t>
-            </w:r>
-          </w:p>
-        </w:tc>
-      </w:tr>
-      <w:tr>
-        <w:tc>
-          <w:tcPr>
-            <w:tcW w:w="1592" w:type="dxa"/>
-          </w:tcPr>
-          <w:p>
-            <w:r>
-              <w:t>Knight move conditions</w:t>
-            </w:r>
-          </w:p>
-        </w:tc>
-        <w:tc>
-          <w:tcPr>
-            <w:tcW w:w="2798" w:type="dxa"/>
-          </w:tcPr>
-          <w:p>
-            <w:pPr>
+            </w:pPr>
+            <w:r>
               <w:rPr>
                 <w:sz w:val="22"/>
                 <w:szCs w:val="22"/>
               </w:rPr>
-            </w:pPr>
+              <w:t>Block a</w:t>
+            </w:r>
             <w:r>
               <w:rPr>
                 <w:sz w:val="22"/>
                 <w:szCs w:val="22"/>
               </w:rPr>
-              <w:t>Block a</w:t>
+              <w:t xml:space="preserve">ny </w:t>
             </w:r>
             <w:r>
               <w:rPr>
                 <w:sz w:val="22"/>
                 <w:szCs w:val="22"/>
               </w:rPr>
-              <w:t xml:space="preserve">ny </w:t>
-            </w:r>
-            <w:r>
+              <w:t>invalid movements specific for King piece (destinations that are more than 1 step away from the current destination across any axis)</w:t>
+            </w:r>
+          </w:p>
+        </w:tc>
+        <w:tc>
+          <w:tcPr>
+            <w:tcW w:w="1842" w:type="dxa"/>
+          </w:tcPr>
+          <w:p>
+            <w:r>
+              <w:t>GamePlayer.cs</w:t>
+            </w:r>
+          </w:p>
+          <w:p>
+            <w:r>
+              <w:t>Line 173 – 185</w:t>
+            </w:r>
+          </w:p>
+        </w:tc>
+        <w:tc>
+          <w:tcPr>
+            <w:tcW w:w="2784" w:type="dxa"/>
+          </w:tcPr>
+          <w:p>
+            <w:r>
+              <w:t>TryMoveKingTests.cs</w:t>
+            </w:r>
+          </w:p>
+          <w:p>
+            <w:r>
+              <w:t xml:space="preserve">Line 1 </w:t>
+            </w:r>
+            <w:r>
+              <w:t>–</w:t>
+            </w:r>
+            <w:r>
+              <w:t xml:space="preserve"> 69</w:t>
+            </w:r>
+          </w:p>
+        </w:tc>
+      </w:tr>
+      <w:tr>
+        <w:tc>
+          <w:tcPr>
+            <w:tcW w:w="1592" w:type="dxa"/>
+          </w:tcPr>
+          <w:p>
+            <w:r>
+              <w:t>Complete</w:t>
+            </w:r>
+            <w:r>
+              <w:t>d</w:t>
+            </w:r>
+            <w:r>
+              <w:t xml:space="preserve"> game functionality</w:t>
+            </w:r>
+          </w:p>
+        </w:tc>
+        <w:tc>
+          <w:tcPr>
+            <w:tcW w:w="2798" w:type="dxa"/>
+          </w:tcPr>
+          <w:p>
+            <w:pPr>
               <w:rPr>
                 <w:sz w:val="22"/>
                 <w:szCs w:val="22"/>
               </w:rPr>
-              <w:t>invalid movements specific for bishop piece (destinations that are not 2 steps in one axis and 1 step on the other axis)</w:t>
-            </w:r>
-          </w:p>
-        </w:tc>
-        <w:tc>
-          <w:tcPr>
-            <w:tcW w:w="1842" w:type="dxa"/>
-          </w:tcPr>
-          <w:p>
-            <w:proofErr w:type="spellStart"/>
-            <w:r>
-              <w:t>GamePlayer.cs</w:t>
-            </w:r>
-            <w:proofErr w:type="spellEnd"/>
-          </w:p>
-          <w:p>
-            <w:r>
-              <w:t>Line 158 – 171</w:t>
-            </w:r>
-          </w:p>
-        </w:tc>
-        <w:tc>
-          <w:tcPr>
-            <w:tcW w:w="2784" w:type="dxa"/>
-          </w:tcPr>
-          <w:p>
-            <w:proofErr w:type="spellStart"/>
-            <w:r>
-              <w:t>TryMoveKnightTests.cs</w:t>
-            </w:r>
-            <w:proofErr w:type="spellEnd"/>
-          </w:p>
-          <w:p>
-            <w:r>
-              <w:t xml:space="preserve">Line 1 </w:t>
-            </w:r>
-            <w:r>
-              <w:t>–</w:t>
-            </w:r>
-            <w:r>
-              <w:t xml:space="preserve"> 58</w:t>
-            </w:r>
-          </w:p>
-        </w:tc>
-      </w:tr>
-      <w:tr>
-        <w:tc>
-          <w:tcPr>
-            <w:tcW w:w="1592" w:type="dxa"/>
-          </w:tcPr>
-          <w:p>
-            <w:r>
-              <w:t>King move conditions</w:t>
-            </w:r>
-          </w:p>
-        </w:tc>
-        <w:tc>
-          <w:tcPr>
-            <w:tcW w:w="2798" w:type="dxa"/>
-          </w:tcPr>
-          <w:p>
-            <w:pPr>
+            </w:pPr>
+            <w:r>
               <w:rPr>
                 <w:sz w:val="22"/>
                 <w:szCs w:val="22"/>
               </w:rPr>
-            </w:pPr>
-            <w:r>
+              <w:t>No longer accept any moves after the game has finished until the game has been reset, this is to reduce the risk of mutating the state of the existing game session</w:t>
+            </w:r>
+          </w:p>
+        </w:tc>
+        <w:tc>
+          <w:tcPr>
+            <w:tcW w:w="1842" w:type="dxa"/>
+          </w:tcPr>
+          <w:p>
+            <w:r>
+              <w:t>GamePlayer.cs</w:t>
+            </w:r>
+          </w:p>
+          <w:p>
+            <w:r>
+              <w:t>Line 85 – 88,</w:t>
+            </w:r>
+          </w:p>
+          <w:p>
+            <w:r>
+              <w:t>Line 206 – 211</w:t>
+            </w:r>
+          </w:p>
+        </w:tc>
+        <w:tc>
+          <w:tcPr>
+            <w:tcW w:w="2784" w:type="dxa"/>
+          </w:tcPr>
+          <w:p/>
+        </w:tc>
+      </w:tr>
+      <w:tr>
+        <w:tc>
+          <w:tcPr>
+            <w:tcW w:w="1592" w:type="dxa"/>
+          </w:tcPr>
+          <w:p>
+            <w:r>
+              <w:t>Move Record/Move  History</w:t>
+            </w:r>
+          </w:p>
+        </w:tc>
+        <w:tc>
+          <w:tcPr>
+            <w:tcW w:w="2798" w:type="dxa"/>
+          </w:tcPr>
+          <w:p>
+            <w:pPr>
               <w:rPr>
                 <w:sz w:val="22"/>
                 <w:szCs w:val="22"/>
               </w:rPr>
-              <w:t>Block a</w:t>
-            </w:r>
+            </w:pPr>
             <w:r>
               <w:rPr>
                 <w:sz w:val="22"/>
                 <w:szCs w:val="22"/>
               </w:rPr>
-              <w:t xml:space="preserve">ny </w:t>
+              <w:t xml:space="preserve">Stores all successful movements in the current game session into a list, this list </w:t>
             </w:r>
             <w:r>
               <w:rPr>
                 <w:sz w:val="22"/>
                 <w:szCs w:val="22"/>
               </w:rPr>
-              <w:t>invalid movements specific for King piece (destinations that are more than 1 step away from the current destination across any axis)</w:t>
-            </w:r>
-          </w:p>
-        </w:tc>
-        <w:tc>
-          <w:tcPr>
-            <w:tcW w:w="1842" w:type="dxa"/>
-          </w:tcPr>
-          <w:p>
-            <w:proofErr w:type="spellStart"/>
-            <w:r>
-              <w:t>GamePlayer.cs</w:t>
-            </w:r>
-            <w:proofErr w:type="spellEnd"/>
-          </w:p>
-          <w:p>
-            <w:r>
-              <w:t>Line 173 – 185</w:t>
-            </w:r>
-          </w:p>
-        </w:tc>
-        <w:tc>
-          <w:tcPr>
-            <w:tcW w:w="2784" w:type="dxa"/>
-          </w:tcPr>
-          <w:p>
-            <w:proofErr w:type="spellStart"/>
-            <w:r>
-              <w:t>TryMoveKingTests.cs</w:t>
-            </w:r>
-            <w:proofErr w:type="spellEnd"/>
-          </w:p>
-          <w:p>
-            <w:r>
-              <w:t xml:space="preserve">Line 1 </w:t>
-            </w:r>
-            <w:r>
-              <w:t>–</w:t>
-            </w:r>
-            <w:r>
-              <w:t xml:space="preserve"> 69</w:t>
-            </w:r>
-          </w:p>
-        </w:tc>
-      </w:tr>
-      <w:tr>
-        <w:tc>
-          <w:tcPr>
-            <w:tcW w:w="1592" w:type="dxa"/>
-          </w:tcPr>
-          <w:p>
-            <w:r>
-              <w:t>Complete</w:t>
-            </w:r>
-            <w:r>
-              <w:t>d</w:t>
-            </w:r>
-            <w:r>
-              <w:t xml:space="preserve"> game functionality</w:t>
-            </w:r>
-          </w:p>
-        </w:tc>
-        <w:tc>
-          <w:tcPr>
-            <w:tcW w:w="2798" w:type="dxa"/>
-          </w:tcPr>
-          <w:p>
-            <w:pPr>
+              <w:t>can</w:t>
+            </w:r>
+            <w:r>
               <w:rPr>
                 <w:sz w:val="22"/>
                 <w:szCs w:val="22"/>
               </w:rPr>
-            </w:pPr>
-            <w:r>
-              <w:rPr>
-                <w:sz w:val="22"/>
-                <w:szCs w:val="22"/>
-              </w:rPr>
-              <w:t>No longer accept any moves after the game has finished until the game has been reset, this is to reduce the risk of mutating the state of the existing game session</w:t>
+              <w:t xml:space="preserve"> be cleared upon game reset</w:t>
             </w:r>
           </w:p>
         </w:tc>
@@ -1303,89 +1257,9 @@
             <w:tcW w:w="1842" w:type="dxa"/>
           </w:tcPr>
           <w:p>
-            <w:proofErr w:type="spellStart"/>
             <w:r>
               <w:t>GamePlayer.cs</w:t>
             </w:r>
-            <w:proofErr w:type="spellEnd"/>
-          </w:p>
-          <w:p>
-            <w:r>
-              <w:t>Line 85 – 88,</w:t>
-            </w:r>
-          </w:p>
-          <w:p>
-            <w:r>
-              <w:t>Line 206 – 211</w:t>
-            </w:r>
-          </w:p>
-        </w:tc>
-        <w:tc>
-          <w:tcPr>
-            <w:tcW w:w="2784" w:type="dxa"/>
-          </w:tcPr>
-          <w:p>
-            <w:r>
-              <w:t>[ all test pieces ]</w:t>
-            </w:r>
-          </w:p>
-        </w:tc>
-      </w:tr>
-      <w:tr>
-        <w:tc>
-          <w:tcPr>
-            <w:tcW w:w="1592" w:type="dxa"/>
-          </w:tcPr>
-          <w:p>
-            <w:r>
-              <w:t>Move Record/Move  History</w:t>
-            </w:r>
-          </w:p>
-        </w:tc>
-        <w:tc>
-          <w:tcPr>
-            <w:tcW w:w="2798" w:type="dxa"/>
-          </w:tcPr>
-          <w:p>
-            <w:pPr>
-              <w:rPr>
-                <w:sz w:val="22"/>
-                <w:szCs w:val="22"/>
-              </w:rPr>
-            </w:pPr>
-            <w:r>
-              <w:rPr>
-                <w:sz w:val="22"/>
-                <w:szCs w:val="22"/>
-              </w:rPr>
-              <w:t xml:space="preserve">Stores all successful movements in the current game session into a list, this list </w:t>
-            </w:r>
-            <w:r>
-              <w:rPr>
-                <w:sz w:val="22"/>
-                <w:szCs w:val="22"/>
-              </w:rPr>
-              <w:t>can</w:t>
-            </w:r>
-            <w:r>
-              <w:rPr>
-                <w:sz w:val="22"/>
-                <w:szCs w:val="22"/>
-              </w:rPr>
-              <w:t xml:space="preserve"> be cleared upon game reset</w:t>
-            </w:r>
-          </w:p>
-        </w:tc>
-        <w:tc>
-          <w:tcPr>
-            <w:tcW w:w="1842" w:type="dxa"/>
-          </w:tcPr>
-          <w:p>
-            <w:proofErr w:type="spellStart"/>
-            <w:r>
-              <w:t>GamePlayer.cs</w:t>
-            </w:r>
-            <w:proofErr w:type="spellEnd"/>
           </w:p>
           <w:p>
             <w:r>
@@ -1506,11 +1380,9 @@
             </w:r>
           </w:p>
           <w:p>
-            <w:proofErr w:type="spellStart"/>
             <w:r>
               <w:t>IGamePlayer</w:t>
             </w:r>
-            <w:proofErr w:type="spellEnd"/>
           </w:p>
         </w:tc>
         <w:tc>
@@ -1532,50 +1404,71 @@
           </w:tcPr>
           <w:p>
             <w:r>
-              <w:t xml:space="preserve">Used by </w:t>
-            </w:r>
-            <w:proofErr w:type="spellStart"/>
+              <w:t>Used by GamePlayer class</w:t>
+            </w:r>
+          </w:p>
+        </w:tc>
+      </w:tr>
+      <w:tr>
+        <w:tc>
+          <w:tcPr>
+            <w:tcW w:w="3005" w:type="dxa"/>
+          </w:tcPr>
+          <w:p>
+            <w:r>
+              <w:t>«class»</w:t>
+            </w:r>
+          </w:p>
+          <w:p>
             <w:r>
               <w:t>GamePlayer</w:t>
             </w:r>
-            <w:proofErr w:type="spellEnd"/>
-            <w:r>
-              <w:t xml:space="preserve"> class</w:t>
-            </w:r>
-          </w:p>
-        </w:tc>
-      </w:tr>
-      <w:tr>
+          </w:p>
+        </w:tc>
         <w:tc>
           <w:tcPr>
             <w:tcW w:w="3005" w:type="dxa"/>
           </w:tcPr>
           <w:p>
             <w:r>
-              <w:t>«</w:t>
-            </w:r>
-            <w:r>
-              <w:t>class</w:t>
-            </w:r>
-            <w:r>
-              <w:t>»</w:t>
-            </w:r>
-          </w:p>
-          <w:p>
-            <w:proofErr w:type="spellStart"/>
-            <w:r>
-              <w:t>GamePlayer</w:t>
-            </w:r>
-            <w:proofErr w:type="spellEnd"/>
-          </w:p>
-        </w:tc>
+              <w:t>The core functionality of the application</w:t>
+            </w:r>
+          </w:p>
+        </w:tc>
+        <w:tc>
+          <w:tcPr>
+            <w:tcW w:w="3006" w:type="dxa"/>
+          </w:tcPr>
+          <w:p>
+            <w:r>
+              <w:t>Uses Struct and MoveRecord, returns MoveResult and PieceType</w:t>
+            </w:r>
+          </w:p>
+        </w:tc>
+      </w:tr>
+      <w:tr>
         <w:tc>
           <w:tcPr>
             <w:tcW w:w="3005" w:type="dxa"/>
           </w:tcPr>
           <w:p>
             <w:r>
-              <w:t>The core functionality of the application</w:t>
+              <w:t>«struct»</w:t>
+            </w:r>
+          </w:p>
+          <w:p>
+            <w:r>
+              <w:t>MoveRecord</w:t>
+            </w:r>
+          </w:p>
+        </w:tc>
+        <w:tc>
+          <w:tcPr>
+            <w:tcW w:w="3005" w:type="dxa"/>
+          </w:tcPr>
+          <w:p>
+            <w:r>
+              <w:t>The structure for game movement records</w:t>
             </w:r>
           </w:p>
         </w:tc>
@@ -1585,57 +1478,169 @@
           </w:tcPr>
           <w:p>
             <w:r>
-              <w:t xml:space="preserve">Uses Struct and </w:t>
-            </w:r>
-            <w:proofErr w:type="spellStart"/>
-            <w:r>
-              <w:t>MoveRecord</w:t>
-            </w:r>
-            <w:proofErr w:type="spellEnd"/>
-            <w:r>
-              <w:t xml:space="preserve">, returns </w:t>
-            </w:r>
-            <w:proofErr w:type="spellStart"/>
+              <w:t>Used by GamePlayer class</w:t>
+            </w:r>
+          </w:p>
+        </w:tc>
+      </w:tr>
+      <w:tr>
+        <w:tc>
+          <w:tcPr>
+            <w:tcW w:w="3005" w:type="dxa"/>
+          </w:tcPr>
+          <w:p>
+            <w:r>
+              <w:t>«enum»</w:t>
+            </w:r>
+          </w:p>
+          <w:p>
             <w:r>
               <w:t>MoveResult</w:t>
             </w:r>
-            <w:proofErr w:type="spellEnd"/>
-            <w:r>
-              <w:t xml:space="preserve"> and </w:t>
-            </w:r>
-            <w:proofErr w:type="spellStart"/>
+          </w:p>
+        </w:tc>
+        <w:tc>
+          <w:tcPr>
+            <w:tcW w:w="3005" w:type="dxa"/>
+          </w:tcPr>
+          <w:p>
+            <w:r>
+              <w:t>Describ</w:t>
+            </w:r>
+            <w:r>
+              <w:t>ing</w:t>
+            </w:r>
+            <w:r>
+              <w:t xml:space="preserve"> the observable result of a move request.</w:t>
+            </w:r>
+          </w:p>
+        </w:tc>
+        <w:tc>
+          <w:tcPr>
+            <w:tcW w:w="3006" w:type="dxa"/>
+          </w:tcPr>
+          <w:p>
+            <w:r>
+              <w:t>Returned by GamePlayer class</w:t>
+            </w:r>
+          </w:p>
+        </w:tc>
+      </w:tr>
+      <w:tr>
+        <w:tc>
+          <w:tcPr>
+            <w:tcW w:w="3005" w:type="dxa"/>
+          </w:tcPr>
+          <w:p>
+            <w:r>
+              <w:t>«static»</w:t>
+            </w:r>
+          </w:p>
+          <w:p>
+            <w:r>
+              <w:t>ReferenceBoardData</w:t>
+            </w:r>
+          </w:p>
+        </w:tc>
+        <w:tc>
+          <w:tcPr>
+            <w:tcW w:w="3005" w:type="dxa"/>
+          </w:tcPr>
+          <w:p>
+            <w:r>
+              <w:t>Provid</w:t>
+            </w:r>
+            <w:r>
+              <w:t>ing</w:t>
+            </w:r>
+            <w:r>
+              <w:t xml:space="preserve"> </w:t>
+            </w:r>
+            <w:r>
+              <w:t>a</w:t>
+            </w:r>
+            <w:r>
+              <w:t xml:space="preserve"> known-good in-memory board</w:t>
+            </w:r>
+          </w:p>
+        </w:tc>
+        <w:tc>
+          <w:tcPr>
+            <w:tcW w:w="3006" w:type="dxa"/>
+          </w:tcPr>
+          <w:p>
+            <w:r>
+              <w:t>Used by GamePlayer class</w:t>
+            </w:r>
+          </w:p>
+        </w:tc>
+      </w:tr>
+      <w:tr>
+        <w:tc>
+          <w:tcPr>
+            <w:tcW w:w="3005" w:type="dxa"/>
+          </w:tcPr>
+          <w:p>
+            <w:r>
+              <w:t>«struct»</w:t>
+            </w:r>
+          </w:p>
+          <w:p>
+            <w:r>
+              <w:t>Position</w:t>
+            </w:r>
+          </w:p>
+        </w:tc>
+        <w:tc>
+          <w:tcPr>
+            <w:tcW w:w="3005" w:type="dxa"/>
+          </w:tcPr>
+          <w:p>
+            <w:r>
+              <w:t>Identifying a coordinate/position in a board</w:t>
+            </w:r>
+          </w:p>
+        </w:tc>
+        <w:tc>
+          <w:tcPr>
+            <w:tcW w:w="3006" w:type="dxa"/>
+          </w:tcPr>
+          <w:p>
+            <w:r>
+              <w:t>Used by GamePlayer class and ReferenceBoardData, Contained in MoveRecord</w:t>
+            </w:r>
+          </w:p>
+        </w:tc>
+      </w:tr>
+      <w:tr>
+        <w:tc>
+          <w:tcPr>
+            <w:tcW w:w="3005" w:type="dxa"/>
+          </w:tcPr>
+          <w:p>
+            <w:r>
+              <w:t>«enum»</w:t>
+            </w:r>
+          </w:p>
+          <w:p>
             <w:r>
               <w:t>PieceType</w:t>
             </w:r>
-            <w:proofErr w:type="spellEnd"/>
-          </w:p>
-        </w:tc>
-      </w:tr>
-      <w:tr>
+          </w:p>
+        </w:tc>
         <w:tc>
           <w:tcPr>
             <w:tcW w:w="3005" w:type="dxa"/>
           </w:tcPr>
           <w:p>
             <w:r>
-              <w:t>«struct»</w:t>
-            </w:r>
-          </w:p>
-          <w:p>
-            <w:proofErr w:type="spellStart"/>
-            <w:r>
-              <w:t>MoveRecord</w:t>
-            </w:r>
-            <w:proofErr w:type="spellEnd"/>
-          </w:p>
-        </w:tc>
-        <w:tc>
-          <w:tcPr>
-            <w:tcW w:w="3005" w:type="dxa"/>
-          </w:tcPr>
-          <w:p>
-            <w:r>
-              <w:t>The structure for game movement records</w:t>
+              <w:t>Identify</w:t>
+            </w:r>
+            <w:r>
+              <w:t>ing</w:t>
+            </w:r>
+            <w:r>
+              <w:t xml:space="preserve"> a supported chess movement rule.</w:t>
             </w:r>
           </w:p>
         </w:tc>
@@ -1645,268 +1650,8 @@
           </w:tcPr>
           <w:p>
             <w:r>
-              <w:t xml:space="preserve">Used by </w:t>
-            </w:r>
-            <w:proofErr w:type="spellStart"/>
-            <w:r>
-              <w:t>GamePlayer</w:t>
-            </w:r>
-            <w:proofErr w:type="spellEnd"/>
-            <w:r>
-              <w:t xml:space="preserve"> class</w:t>
-            </w:r>
-          </w:p>
-        </w:tc>
-      </w:tr>
-      <w:tr>
-        <w:tc>
-          <w:tcPr>
-            <w:tcW w:w="3005" w:type="dxa"/>
-          </w:tcPr>
-          <w:p>
-            <w:r>
-              <w:t>«</w:t>
-            </w:r>
-            <w:proofErr w:type="spellStart"/>
-            <w:r>
-              <w:t>enum</w:t>
-            </w:r>
-            <w:proofErr w:type="spellEnd"/>
-            <w:r>
-              <w:t>»</w:t>
-            </w:r>
-          </w:p>
-          <w:p>
-            <w:proofErr w:type="spellStart"/>
-            <w:r>
-              <w:t>MoveResult</w:t>
-            </w:r>
-            <w:proofErr w:type="spellEnd"/>
-          </w:p>
-        </w:tc>
-        <w:tc>
-          <w:tcPr>
-            <w:tcW w:w="3005" w:type="dxa"/>
-          </w:tcPr>
-          <w:p>
-            <w:r>
-              <w:t>Describ</w:t>
-            </w:r>
-            <w:r>
-              <w:t>ing</w:t>
-            </w:r>
-            <w:r>
-              <w:t xml:space="preserve"> the observable result of a move request.</w:t>
-            </w:r>
-          </w:p>
-        </w:tc>
-        <w:tc>
-          <w:tcPr>
-            <w:tcW w:w="3006" w:type="dxa"/>
-          </w:tcPr>
-          <w:p>
-            <w:r>
-              <w:t xml:space="preserve">Returned by </w:t>
-            </w:r>
-            <w:proofErr w:type="spellStart"/>
-            <w:r>
-              <w:t>GamePlayer</w:t>
-            </w:r>
-            <w:proofErr w:type="spellEnd"/>
-            <w:r>
-              <w:t xml:space="preserve"> class</w:t>
-            </w:r>
-          </w:p>
-        </w:tc>
-      </w:tr>
-      <w:tr>
-        <w:tc>
-          <w:tcPr>
-            <w:tcW w:w="3005" w:type="dxa"/>
-          </w:tcPr>
-          <w:p>
-            <w:r>
-              <w:t>«static»</w:t>
-            </w:r>
-          </w:p>
-          <w:p>
-            <w:proofErr w:type="spellStart"/>
-            <w:r>
-              <w:t>ReferenceBoardData</w:t>
-            </w:r>
-            <w:proofErr w:type="spellEnd"/>
-          </w:p>
-        </w:tc>
-        <w:tc>
-          <w:tcPr>
-            <w:tcW w:w="3005" w:type="dxa"/>
-          </w:tcPr>
-          <w:p>
-            <w:r>
-              <w:t>Provid</w:t>
-            </w:r>
-            <w:r>
-              <w:t>ing</w:t>
-            </w:r>
-            <w:r>
-              <w:t xml:space="preserve"> </w:t>
-            </w:r>
-            <w:r>
-              <w:t>a</w:t>
-            </w:r>
-            <w:r>
-              <w:t xml:space="preserve"> known-good in-memory board</w:t>
-            </w:r>
-          </w:p>
-        </w:tc>
-        <w:tc>
-          <w:tcPr>
-            <w:tcW w:w="3006" w:type="dxa"/>
-          </w:tcPr>
-          <w:p>
-            <w:r>
-              <w:t xml:space="preserve">Used by </w:t>
-            </w:r>
-            <w:proofErr w:type="spellStart"/>
-            <w:r>
-              <w:t>GamePlayer</w:t>
-            </w:r>
-            <w:proofErr w:type="spellEnd"/>
-            <w:r>
-              <w:t xml:space="preserve"> class</w:t>
-            </w:r>
-          </w:p>
-        </w:tc>
-      </w:tr>
-      <w:tr>
-        <w:tc>
-          <w:tcPr>
-            <w:tcW w:w="3005" w:type="dxa"/>
-          </w:tcPr>
-          <w:p>
-            <w:r>
-              <w:t>«struct»</w:t>
-            </w:r>
-          </w:p>
-          <w:p>
-            <w:r>
-              <w:t>Position</w:t>
-            </w:r>
-          </w:p>
-        </w:tc>
-        <w:tc>
-          <w:tcPr>
-            <w:tcW w:w="3005" w:type="dxa"/>
-          </w:tcPr>
-          <w:p>
-            <w:r>
-              <w:t>Identifying a coordinate/position in a board</w:t>
-            </w:r>
-          </w:p>
-        </w:tc>
-        <w:tc>
-          <w:tcPr>
-            <w:tcW w:w="3006" w:type="dxa"/>
-          </w:tcPr>
-          <w:p>
-            <w:r>
-              <w:t xml:space="preserve">Used by </w:t>
-            </w:r>
-            <w:proofErr w:type="spellStart"/>
-            <w:r>
-              <w:t>GamePlayer</w:t>
-            </w:r>
-            <w:proofErr w:type="spellEnd"/>
-            <w:r>
-              <w:t xml:space="preserve"> class and </w:t>
-            </w:r>
-            <w:proofErr w:type="spellStart"/>
-            <w:r>
-              <w:t>ReferenceBoardData</w:t>
-            </w:r>
-            <w:proofErr w:type="spellEnd"/>
-            <w:r>
-              <w:t xml:space="preserve">, Contained in </w:t>
-            </w:r>
-            <w:proofErr w:type="spellStart"/>
-            <w:r>
-              <w:t>MoveRecord</w:t>
-            </w:r>
-            <w:proofErr w:type="spellEnd"/>
-          </w:p>
-        </w:tc>
-      </w:tr>
-      <w:tr>
-        <w:tc>
-          <w:tcPr>
-            <w:tcW w:w="3005" w:type="dxa"/>
-          </w:tcPr>
-          <w:p>
-            <w:r>
-              <w:t>«</w:t>
-            </w:r>
-            <w:proofErr w:type="spellStart"/>
-            <w:r>
-              <w:t>enum</w:t>
-            </w:r>
-            <w:proofErr w:type="spellEnd"/>
-            <w:r>
-              <w:t>»</w:t>
-            </w:r>
-          </w:p>
-          <w:p>
-            <w:proofErr w:type="spellStart"/>
-            <w:r>
-              <w:t>PieceType</w:t>
-            </w:r>
-            <w:proofErr w:type="spellEnd"/>
-          </w:p>
-        </w:tc>
-        <w:tc>
-          <w:tcPr>
-            <w:tcW w:w="3005" w:type="dxa"/>
-          </w:tcPr>
-          <w:p>
-            <w:r>
-              <w:t>Identify</w:t>
-            </w:r>
-            <w:r>
-              <w:t>ing</w:t>
-            </w:r>
-            <w:r>
-              <w:t xml:space="preserve"> a supported chess movement rule.</w:t>
-            </w:r>
-          </w:p>
-        </w:tc>
-        <w:tc>
-          <w:tcPr>
-            <w:tcW w:w="3006" w:type="dxa"/>
-          </w:tcPr>
-          <w:p>
-            <w:r>
-              <w:t xml:space="preserve">Used by </w:t>
-            </w:r>
-            <w:proofErr w:type="spellStart"/>
-            <w:r>
-              <w:t>ReferenceBoardData</w:t>
-            </w:r>
-            <w:proofErr w:type="spellEnd"/>
-            <w:r>
-              <w:t xml:space="preserve">, contained in </w:t>
-            </w:r>
-            <w:proofErr w:type="spellStart"/>
-            <w:r>
-              <w:t>MoveRecord</w:t>
-            </w:r>
-            <w:proofErr w:type="spellEnd"/>
-            <w:r>
-              <w:t xml:space="preserve">, returned by </w:t>
-            </w:r>
-            <w:proofErr w:type="spellStart"/>
-            <w:r>
-              <w:t>GamePlayer</w:t>
-            </w:r>
-            <w:proofErr w:type="spellEnd"/>
+              <w:t>Used by ReferenceBoardData, contained in MoveRecord, returned by GamePlayer</w:t>
+            </w:r>
           </w:p>
         </w:tc>
       </w:tr>
@@ -2036,11 +1781,9 @@
             <w:tcW w:w="4850" w:type="dxa"/>
           </w:tcPr>
           <w:p>
-            <w:proofErr w:type="spellStart"/>
             <w:r>
               <w:t>NewGame_InitializesSuccesfully</w:t>
             </w:r>
-            <w:proofErr w:type="spellEnd"/>
           </w:p>
         </w:tc>
         <w:tc>
@@ -2135,11 +1878,9 @@
             <w:tcW w:w="4850" w:type="dxa"/>
           </w:tcPr>
           <w:p>
-            <w:proofErr w:type="spellStart"/>
             <w:r>
               <w:t>NewGame_CorrectPlayerPositions</w:t>
             </w:r>
-            <w:proofErr w:type="spellEnd"/>
           </w:p>
         </w:tc>
         <w:tc>
@@ -2153,69 +1894,42 @@
                 <w:szCs w:val="18"/>
               </w:rPr>
             </w:pPr>
-            <w:proofErr w:type="spellStart"/>
-            <w:r>
-              <w:rPr>
-                <w:sz w:val="18"/>
-                <w:szCs w:val="18"/>
-              </w:rPr>
-              <w:t>StartPosition</w:t>
-            </w:r>
-            <w:proofErr w:type="spellEnd"/>
-            <w:r>
-              <w:rPr>
-                <w:sz w:val="18"/>
-                <w:szCs w:val="18"/>
-              </w:rPr>
-              <w:t xml:space="preserve"> = 5,0</w:t>
-            </w:r>
-          </w:p>
-          <w:p>
-            <w:pPr>
-              <w:rPr>
-                <w:sz w:val="18"/>
-                <w:szCs w:val="18"/>
-              </w:rPr>
-            </w:pPr>
-            <w:proofErr w:type="spellStart"/>
-            <w:r>
-              <w:rPr>
-                <w:sz w:val="18"/>
-                <w:szCs w:val="18"/>
-              </w:rPr>
-              <w:t>CurrentPosition</w:t>
-            </w:r>
-            <w:proofErr w:type="spellEnd"/>
-            <w:r>
-              <w:rPr>
-                <w:sz w:val="18"/>
-                <w:szCs w:val="18"/>
-              </w:rPr>
-              <w:t>= 5,0</w:t>
-            </w:r>
-          </w:p>
-          <w:p>
-            <w:pPr>
-              <w:rPr>
-                <w:sz w:val="18"/>
-                <w:szCs w:val="18"/>
-              </w:rPr>
-            </w:pPr>
-            <w:proofErr w:type="spellStart"/>
-            <w:r>
-              <w:rPr>
-                <w:sz w:val="18"/>
-                <w:szCs w:val="18"/>
-              </w:rPr>
-              <w:t>TargetPosition</w:t>
-            </w:r>
-            <w:proofErr w:type="spellEnd"/>
-            <w:r>
-              <w:rPr>
-                <w:sz w:val="18"/>
-                <w:szCs w:val="18"/>
-              </w:rPr>
-              <w:t xml:space="preserve"> = 0,5</w:t>
+            <w:r>
+              <w:rPr>
+                <w:sz w:val="18"/>
+                <w:szCs w:val="18"/>
+              </w:rPr>
+              <w:t>StartPosition = 5,0</w:t>
+            </w:r>
+          </w:p>
+          <w:p>
+            <w:pPr>
+              <w:rPr>
+                <w:sz w:val="18"/>
+                <w:szCs w:val="18"/>
+              </w:rPr>
+            </w:pPr>
+            <w:r>
+              <w:rPr>
+                <w:sz w:val="18"/>
+                <w:szCs w:val="18"/>
+              </w:rPr>
+              <w:t>CurrentPosition= 5,0</w:t>
+            </w:r>
+          </w:p>
+          <w:p>
+            <w:pPr>
+              <w:rPr>
+                <w:sz w:val="18"/>
+                <w:szCs w:val="18"/>
+              </w:rPr>
+            </w:pPr>
+            <w:r>
+              <w:rPr>
+                <w:sz w:val="18"/>
+                <w:szCs w:val="18"/>
+              </w:rPr>
+              <w:t>TargetPosition = 0,5</w:t>
             </w:r>
           </w:p>
         </w:tc>
@@ -2246,11 +1960,9 @@
             <w:tcW w:w="4850" w:type="dxa"/>
           </w:tcPr>
           <w:p>
-            <w:proofErr w:type="spellStart"/>
             <w:r>
               <w:t>NewGame_CorrectPiecePositions</w:t>
             </w:r>
-            <w:proofErr w:type="spellEnd"/>
           </w:p>
         </w:tc>
         <w:tc>
@@ -2360,11 +2072,9 @@
             <w:tcW w:w="4850" w:type="dxa"/>
           </w:tcPr>
           <w:p>
-            <w:proofErr w:type="spellStart"/>
             <w:r>
               <w:t>Restart_InitializesSuccesfully</w:t>
             </w:r>
-            <w:proofErr w:type="spellEnd"/>
           </w:p>
         </w:tc>
         <w:tc>
@@ -2459,11 +2169,9 @@
             <w:tcW w:w="4850" w:type="dxa"/>
           </w:tcPr>
           <w:p>
-            <w:proofErr w:type="spellStart"/>
             <w:r>
               <w:t>Restart_CorrectPlayerPositions</w:t>
             </w:r>
-            <w:proofErr w:type="spellEnd"/>
           </w:p>
           <w:p/>
         </w:tc>
@@ -2478,69 +2186,42 @@
                 <w:szCs w:val="18"/>
               </w:rPr>
             </w:pPr>
-            <w:proofErr w:type="spellStart"/>
-            <w:r>
-              <w:rPr>
-                <w:sz w:val="18"/>
-                <w:szCs w:val="18"/>
-              </w:rPr>
-              <w:t>StartPosition</w:t>
-            </w:r>
-            <w:proofErr w:type="spellEnd"/>
-            <w:r>
-              <w:rPr>
-                <w:sz w:val="18"/>
-                <w:szCs w:val="18"/>
-              </w:rPr>
-              <w:t xml:space="preserve"> = 5,0</w:t>
-            </w:r>
-          </w:p>
-          <w:p>
-            <w:pPr>
-              <w:rPr>
-                <w:sz w:val="18"/>
-                <w:szCs w:val="18"/>
-              </w:rPr>
-            </w:pPr>
-            <w:proofErr w:type="spellStart"/>
-            <w:r>
-              <w:rPr>
-                <w:sz w:val="18"/>
-                <w:szCs w:val="18"/>
-              </w:rPr>
-              <w:t>CurrentPosition</w:t>
-            </w:r>
-            <w:proofErr w:type="spellEnd"/>
-            <w:r>
-              <w:rPr>
-                <w:sz w:val="18"/>
-                <w:szCs w:val="18"/>
-              </w:rPr>
-              <w:t>= 5,0</w:t>
-            </w:r>
-          </w:p>
-          <w:p>
-            <w:pPr>
-              <w:rPr>
-                <w:sz w:val="18"/>
-                <w:szCs w:val="18"/>
-              </w:rPr>
-            </w:pPr>
-            <w:proofErr w:type="spellStart"/>
-            <w:r>
-              <w:rPr>
-                <w:sz w:val="18"/>
-                <w:szCs w:val="18"/>
-              </w:rPr>
-              <w:t>TargetPosition</w:t>
-            </w:r>
-            <w:proofErr w:type="spellEnd"/>
-            <w:r>
-              <w:rPr>
-                <w:sz w:val="18"/>
-                <w:szCs w:val="18"/>
-              </w:rPr>
-              <w:t xml:space="preserve"> = 0,5</w:t>
+            <w:r>
+              <w:rPr>
+                <w:sz w:val="18"/>
+                <w:szCs w:val="18"/>
+              </w:rPr>
+              <w:t>StartPosition = 5,0</w:t>
+            </w:r>
+          </w:p>
+          <w:p>
+            <w:pPr>
+              <w:rPr>
+                <w:sz w:val="18"/>
+                <w:szCs w:val="18"/>
+              </w:rPr>
+            </w:pPr>
+            <w:r>
+              <w:rPr>
+                <w:sz w:val="18"/>
+                <w:szCs w:val="18"/>
+              </w:rPr>
+              <w:t>CurrentPosition= 5,0</w:t>
+            </w:r>
+          </w:p>
+          <w:p>
+            <w:pPr>
+              <w:rPr>
+                <w:sz w:val="18"/>
+                <w:szCs w:val="18"/>
+              </w:rPr>
+            </w:pPr>
+            <w:r>
+              <w:rPr>
+                <w:sz w:val="18"/>
+                <w:szCs w:val="18"/>
+              </w:rPr>
+              <w:t>TargetPosition = 0,5</w:t>
             </w:r>
           </w:p>
         </w:tc>
@@ -2564,11 +2245,9 @@
             <w:r>
               <w:t xml:space="preserve">Game returns </w:t>
             </w:r>
-            <w:proofErr w:type="spellStart"/>
             <w:r>
               <w:t>OutOfBounds</w:t>
             </w:r>
-            <w:proofErr w:type="spellEnd"/>
             <w:r>
               <w:t xml:space="preserve"> for positions outside of playable game board</w:t>
             </w:r>
@@ -2585,7 +2264,6 @@
                 <w:szCs w:val="18"/>
               </w:rPr>
             </w:pPr>
-            <w:proofErr w:type="spellStart"/>
             <w:r>
               <w:rPr>
                 <w:sz w:val="18"/>
@@ -2593,7 +2271,6 @@
               </w:rPr>
               <w:t>TryMove_OutOfBounds_ReturnsOutOfBounds</w:t>
             </w:r>
-            <w:proofErr w:type="spellEnd"/>
           </w:p>
           <w:p/>
         </w:tc>
@@ -2608,7 +2285,6 @@
                 <w:szCs w:val="18"/>
               </w:rPr>
             </w:pPr>
-            <w:proofErr w:type="spellStart"/>
             <w:r>
               <w:rPr>
                 <w:sz w:val="18"/>
@@ -2616,7 +2292,6 @@
               </w:rPr>
               <w:t>OutOfBounds</w:t>
             </w:r>
-            <w:proofErr w:type="spellEnd"/>
           </w:p>
         </w:tc>
         <w:tc>
@@ -2652,7 +2327,6 @@
                 <w:szCs w:val="18"/>
               </w:rPr>
             </w:pPr>
-            <w:proofErr w:type="spellStart"/>
             <w:r>
               <w:rPr>
                 <w:sz w:val="18"/>
@@ -2660,7 +2334,6 @@
               </w:rPr>
               <w:t>TryMove_GameCompleted_ReturnsGameAlreadyCompleted</w:t>
             </w:r>
-            <w:proofErr w:type="spellEnd"/>
           </w:p>
           <w:p>
             <w:pPr>
@@ -2682,7 +2355,6 @@
                 <w:szCs w:val="18"/>
               </w:rPr>
             </w:pPr>
-            <w:proofErr w:type="spellStart"/>
             <w:r>
               <w:rPr>
                 <w:sz w:val="18"/>
@@ -2690,7 +2362,6 @@
               </w:rPr>
               <w:t>GameAlreadyCompleted</w:t>
             </w:r>
-            <w:proofErr w:type="spellEnd"/>
           </w:p>
           <w:p>
             <w:pPr>
@@ -2740,7 +2411,6 @@
                 <w:szCs w:val="18"/>
               </w:rPr>
             </w:pPr>
-            <w:proofErr w:type="spellStart"/>
             <w:r>
               <w:rPr>
                 <w:sz w:val="18"/>
@@ -2748,7 +2418,6 @@
               </w:rPr>
               <w:t>TryMove_Rook_IllegalMove_ReturnsInvalidMovement</w:t>
             </w:r>
-            <w:proofErr w:type="spellEnd"/>
             <w:r>
               <w:rPr>
                 <w:sz w:val="18"/>
@@ -2764,7 +2433,6 @@
                 <w:szCs w:val="18"/>
               </w:rPr>
             </w:pPr>
-            <w:proofErr w:type="spellStart"/>
             <w:r>
               <w:rPr>
                 <w:sz w:val="18"/>
@@ -2786,7 +2454,6 @@
               </w:rPr>
               <w:t>_IllegalMove_ReturnsInvalidMovement</w:t>
             </w:r>
-            <w:proofErr w:type="spellEnd"/>
             <w:r>
               <w:rPr>
                 <w:sz w:val="18"/>
@@ -2802,7 +2469,6 @@
                 <w:szCs w:val="18"/>
               </w:rPr>
             </w:pPr>
-            <w:proofErr w:type="spellStart"/>
             <w:r>
               <w:rPr>
                 <w:sz w:val="18"/>
@@ -2824,7 +2490,6 @@
               </w:rPr>
               <w:t>_IllegalMove_ReturnsInvalidMovement</w:t>
             </w:r>
-            <w:proofErr w:type="spellEnd"/>
             <w:r>
               <w:rPr>
                 <w:sz w:val="18"/>
@@ -2840,7 +2505,6 @@
                 <w:szCs w:val="18"/>
               </w:rPr>
             </w:pPr>
-            <w:proofErr w:type="spellStart"/>
             <w:r>
               <w:rPr>
                 <w:sz w:val="18"/>
@@ -2862,7 +2526,6 @@
               </w:rPr>
               <w:t>_IllegalMove_ReturnsInvalidMovement</w:t>
             </w:r>
-            <w:proofErr w:type="spellEnd"/>
           </w:p>
           <w:p>
             <w:pPr>
@@ -2892,7 +2555,6 @@
                 <w:szCs w:val="18"/>
               </w:rPr>
             </w:pPr>
-            <w:proofErr w:type="spellStart"/>
             <w:r>
               <w:rPr>
                 <w:sz w:val="18"/>
@@ -2900,7 +2562,6 @@
               </w:rPr>
               <w:t>InvalidMovement</w:t>
             </w:r>
-            <w:proofErr w:type="spellEnd"/>
           </w:p>
           <w:p>
             <w:pPr>
@@ -2929,13 +2590,7 @@
           </w:tcPr>
           <w:p>
             <w:r>
-              <w:t xml:space="preserve">Game </w:t>
-            </w:r>
-            <w:r>
-              <w:t xml:space="preserve">disregards </w:t>
-            </w:r>
-            <w:r>
-              <w:t>piece movements leading to empty squares</w:t>
+              <w:t>Game disregards piece movements leading to empty squares</w:t>
             </w:r>
           </w:p>
         </w:tc>
@@ -2950,7 +2605,6 @@
                 <w:szCs w:val="18"/>
               </w:rPr>
             </w:pPr>
-            <w:proofErr w:type="spellStart"/>
             <w:r>
               <w:rPr>
                 <w:sz w:val="18"/>
@@ -2958,7 +2612,6 @@
               </w:rPr>
               <w:t>TryMove_Rook_EmptyDestination_ReturnsInvalidDestination</w:t>
             </w:r>
-            <w:proofErr w:type="spellEnd"/>
             <w:r>
               <w:rPr>
                 <w:sz w:val="18"/>
@@ -2974,7 +2627,6 @@
                 <w:szCs w:val="18"/>
               </w:rPr>
             </w:pPr>
-            <w:proofErr w:type="spellStart"/>
             <w:r>
               <w:rPr>
                 <w:sz w:val="18"/>
@@ -2996,7 +2648,6 @@
               </w:rPr>
               <w:t>_EmptyDestination_ReturnsInvalidDestination</w:t>
             </w:r>
-            <w:proofErr w:type="spellEnd"/>
             <w:r>
               <w:rPr>
                 <w:sz w:val="18"/>
@@ -3012,7 +2663,6 @@
                 <w:szCs w:val="18"/>
               </w:rPr>
             </w:pPr>
-            <w:proofErr w:type="spellStart"/>
             <w:r>
               <w:rPr>
                 <w:sz w:val="18"/>
@@ -3034,7 +2684,6 @@
               </w:rPr>
               <w:t>_EmptyDestination_ReturnsInvalidDestination</w:t>
             </w:r>
-            <w:proofErr w:type="spellEnd"/>
             <w:r>
               <w:rPr>
                 <w:sz w:val="18"/>
@@ -3050,7 +2699,6 @@
                 <w:szCs w:val="18"/>
               </w:rPr>
             </w:pPr>
-            <w:proofErr w:type="spellStart"/>
             <w:r>
               <w:rPr>
                 <w:sz w:val="18"/>
@@ -3072,7 +2720,6 @@
               </w:rPr>
               <w:t>_EmptyDestination_ReturnsInvalidDestination</w:t>
             </w:r>
-            <w:proofErr w:type="spellEnd"/>
           </w:p>
         </w:tc>
         <w:tc>
@@ -3086,7 +2733,6 @@
                 <w:szCs w:val="18"/>
               </w:rPr>
             </w:pPr>
-            <w:proofErr w:type="spellStart"/>
             <w:r>
               <w:rPr>
                 <w:sz w:val="18"/>
@@ -3094,7 +2740,6 @@
               </w:rPr>
               <w:t>InvalidDestination</w:t>
             </w:r>
-            <w:proofErr w:type="spellEnd"/>
           </w:p>
         </w:tc>
         <w:tc>
@@ -3115,10 +2760,7 @@
           </w:tcPr>
           <w:p>
             <w:r>
-              <w:t xml:space="preserve">Game </w:t>
-            </w:r>
-            <w:r>
-              <w:t xml:space="preserve">disregards </w:t>
+              <w:t xml:space="preserve">Game disregards </w:t>
             </w:r>
             <w:r>
               <w:t>piece</w:t>
@@ -3139,7 +2781,6 @@
                 <w:szCs w:val="18"/>
               </w:rPr>
             </w:pPr>
-            <w:proofErr w:type="spellStart"/>
             <w:r>
               <w:rPr>
                 <w:sz w:val="18"/>
@@ -3147,7 +2788,6 @@
               </w:rPr>
               <w:t>TryMove_Rook_BlockedPath_ReturnsBlockedPath</w:t>
             </w:r>
-            <w:proofErr w:type="spellEnd"/>
             <w:r>
               <w:rPr>
                 <w:sz w:val="18"/>
@@ -3163,7 +2803,6 @@
                 <w:szCs w:val="18"/>
               </w:rPr>
             </w:pPr>
-            <w:proofErr w:type="spellStart"/>
             <w:r>
               <w:rPr>
                 <w:sz w:val="18"/>
@@ -3185,7 +2824,6 @@
               </w:rPr>
               <w:t>_BlockedPath_ReturnsBlockedPath</w:t>
             </w:r>
-            <w:proofErr w:type="spellEnd"/>
             <w:r>
               <w:rPr>
                 <w:sz w:val="18"/>
@@ -3201,7 +2839,6 @@
                 <w:szCs w:val="18"/>
               </w:rPr>
             </w:pPr>
-            <w:proofErr w:type="spellStart"/>
             <w:r>
               <w:rPr>
                 <w:sz w:val="18"/>
@@ -3223,7 +2860,6 @@
               </w:rPr>
               <w:t>_BlockedPath_ReturnsBlockedPath</w:t>
             </w:r>
-            <w:proofErr w:type="spellEnd"/>
             <w:r>
               <w:rPr>
                 <w:sz w:val="18"/>
@@ -3239,7 +2875,6 @@
                 <w:szCs w:val="18"/>
               </w:rPr>
             </w:pPr>
-            <w:proofErr w:type="spellStart"/>
             <w:r>
               <w:rPr>
                 <w:sz w:val="18"/>
@@ -3261,7 +2896,6 @@
               </w:rPr>
               <w:t>_BlockedPath_ReturnsBlockedPath</w:t>
             </w:r>
-            <w:proofErr w:type="spellEnd"/>
             <w:r>
               <w:rPr>
                 <w:sz w:val="18"/>
@@ -3290,7 +2924,6 @@
                 <w:szCs w:val="18"/>
               </w:rPr>
             </w:pPr>
-            <w:proofErr w:type="spellStart"/>
             <w:r>
               <w:rPr>
                 <w:sz w:val="18"/>
@@ -3305,7 +2938,6 @@
               </w:rPr>
               <w:t>athBlocked</w:t>
             </w:r>
-            <w:proofErr w:type="spellEnd"/>
           </w:p>
         </w:tc>
         <w:tc>
@@ -3347,7 +2979,6 @@
                 <w:szCs w:val="18"/>
               </w:rPr>
             </w:pPr>
-            <w:proofErr w:type="spellStart"/>
             <w:r>
               <w:rPr>
                 <w:sz w:val="18"/>
@@ -3355,7 +2986,6 @@
               </w:rPr>
               <w:t>TryMove_Rook_SuccesfulMove_ReturnsSuccess</w:t>
             </w:r>
-            <w:proofErr w:type="spellEnd"/>
             <w:r>
               <w:rPr>
                 <w:sz w:val="18"/>
@@ -3371,7 +3001,6 @@
                 <w:szCs w:val="18"/>
               </w:rPr>
             </w:pPr>
-            <w:proofErr w:type="spellStart"/>
             <w:r>
               <w:rPr>
                 <w:sz w:val="18"/>
@@ -3393,7 +3022,6 @@
               </w:rPr>
               <w:t>_SuccesfulMove_ReturnsSuccess</w:t>
             </w:r>
-            <w:proofErr w:type="spellEnd"/>
             <w:r>
               <w:rPr>
                 <w:sz w:val="18"/>
@@ -3409,7 +3037,6 @@
                 <w:szCs w:val="18"/>
               </w:rPr>
             </w:pPr>
-            <w:proofErr w:type="spellStart"/>
             <w:r>
               <w:rPr>
                 <w:sz w:val="18"/>
@@ -3431,7 +3058,6 @@
               </w:rPr>
               <w:t>_SuccesfulMove_ReturnsSuccess</w:t>
             </w:r>
-            <w:proofErr w:type="spellEnd"/>
             <w:r>
               <w:rPr>
                 <w:sz w:val="18"/>
@@ -3447,7 +3073,6 @@
                 <w:szCs w:val="18"/>
               </w:rPr>
             </w:pPr>
-            <w:proofErr w:type="spellStart"/>
             <w:r>
               <w:rPr>
                 <w:sz w:val="18"/>
@@ -3469,7 +3094,6 @@
               </w:rPr>
               <w:t>_SuccesfulMove_ReturnsSuccess</w:t>
             </w:r>
-            <w:proofErr w:type="spellEnd"/>
           </w:p>
           <w:p>
             <w:pPr>
@@ -3653,23 +3277,7 @@
           </w:tcPr>
           <w:p>
             <w:r>
-              <w:t>Handling custom piece positions for testing purposes (</w:t>
-            </w:r>
-            <w:proofErr w:type="spellStart"/>
-            <w:r>
-              <w:t>eg.</w:t>
-            </w:r>
-            <w:proofErr w:type="spellEnd"/>
-            <w:r>
-              <w:t xml:space="preserve"> Bishop </w:t>
-            </w:r>
-            <w:proofErr w:type="spellStart"/>
-            <w:r>
-              <w:t>PathBlocked</w:t>
-            </w:r>
-            <w:proofErr w:type="spellEnd"/>
-            <w:r>
-              <w:t>)</w:t>
+              <w:t>Handling custom piece positions for testing purposes (eg. Bishop PathBlocked)</w:t>
             </w:r>
           </w:p>
         </w:tc>
@@ -3679,15 +3287,7 @@
           </w:tcPr>
           <w:p>
             <w:r>
-              <w:t xml:space="preserve">Have two separate constructors, one that uses default values in </w:t>
-            </w:r>
-            <w:proofErr w:type="spellStart"/>
-            <w:r>
-              <w:t>ReferenceBoardData</w:t>
-            </w:r>
-            <w:proofErr w:type="spellEnd"/>
-            <w:r>
-              <w:t>, and a separate constructor that uses custom chess piece positions when provided.</w:t>
+              <w:t>Have two separate constructors, one that uses default values in ReferenceBoardData, and a separate constructor that uses custom chess piece positions when provided.</w:t>
             </w:r>
           </w:p>
         </w:tc>
@@ -3706,15 +3306,69 @@
             <w:tcW w:w="2254" w:type="dxa"/>
           </w:tcPr>
           <w:p>
-            <w:proofErr w:type="spellStart"/>
             <w:r>
               <w:t>GamePlayer.cs</w:t>
             </w:r>
-            <w:proofErr w:type="spellEnd"/>
-          </w:p>
-          <w:p>
-            <w:r>
-              <w:t>Line 53 - 69</w:t>
+          </w:p>
+          <w:p>
+            <w:r>
+              <w:t xml:space="preserve">Line 53 </w:t>
+            </w:r>
+            <w:r>
+              <w:t>–</w:t>
+            </w:r>
+            <w:r>
+              <w:t xml:space="preserve"> 69</w:t>
+            </w:r>
+          </w:p>
+        </w:tc>
+      </w:tr>
+      <w:tr>
+        <w:tc>
+          <w:tcPr>
+            <w:tcW w:w="2254" w:type="dxa"/>
+          </w:tcPr>
+          <w:p>
+            <w:r>
+              <w:t>Test code cannot successfully read or verify private values</w:t>
+            </w:r>
+          </w:p>
+        </w:tc>
+        <w:tc>
+          <w:tcPr>
+            <w:tcW w:w="2254" w:type="dxa"/>
+          </w:tcPr>
+          <w:p>
+            <w:r>
+              <w:t>Converting private attributes to internal attributes to be read by test code</w:t>
+            </w:r>
+            <w:r>
+              <w:t xml:space="preserve"> while still ensuring security within the solution</w:t>
+            </w:r>
+          </w:p>
+        </w:tc>
+        <w:tc>
+          <w:tcPr>
+            <w:tcW w:w="2254" w:type="dxa"/>
+          </w:tcPr>
+          <w:p>
+            <w:r>
+              <w:t>Not a commonly used</w:t>
+            </w:r>
+          </w:p>
+        </w:tc>
+        <w:tc>
+          <w:tcPr>
+            <w:tcW w:w="2254" w:type="dxa"/>
+          </w:tcPr>
+          <w:p>
+            <w:r>
+              <w:t>GamePlayer.cs</w:t>
+            </w:r>
+          </w:p>
+          <w:p>
+            <w:r>
+              <w:t>Line 11 - 15</w:t>
             </w:r>
           </w:p>
         </w:tc>
@@ -3798,13 +3452,8 @@
           </w:tcPr>
           <w:p>
             <w:r>
-              <w:t xml:space="preserve">9.0.316, selected by </w:t>
-            </w:r>
-            <w:proofErr w:type="spellStart"/>
-            <w:r>
-              <w:t>global.json</w:t>
-            </w:r>
-            <w:proofErr w:type="spellEnd"/>
+              <w:t>9.0.316, selected by global.json</w:t>
+            </w:r>
           </w:p>
         </w:tc>
       </w:tr>
@@ -3902,42 +3551,41 @@
                 <w:sz w:val="16"/>
                 <w:szCs w:val="16"/>
               </w:rPr>
-              <w:t xml:space="preserve">dotnet run --project </w:t>
-            </w:r>
-            <w:proofErr w:type="spellStart"/>
-            <w:r>
+              <w:t>dotnet run --project src/BCIT615.Assessment1.GamePlayer.App</w:t>
+            </w:r>
+          </w:p>
+        </w:tc>
+      </w:tr>
+      <w:tr>
+        <w:tc>
+          <w:tcPr>
+            <w:tcW w:w="2122" w:type="dxa"/>
+          </w:tcPr>
+          <w:p>
+            <w:r>
+              <w:t>Build result</w:t>
+            </w:r>
+          </w:p>
+        </w:tc>
+        <w:tc>
+          <w:tcPr>
+            <w:tcW w:w="6894" w:type="dxa"/>
+          </w:tcPr>
+          <w:p>
+            <w:pPr>
               <w:rPr>
                 <w:sz w:val="16"/>
                 <w:szCs w:val="16"/>
               </w:rPr>
-              <w:t>src</w:t>
-            </w:r>
-            <w:proofErr w:type="spellEnd"/>
+            </w:pPr>
             <w:r>
               <w:rPr>
                 <w:sz w:val="16"/>
                 <w:szCs w:val="16"/>
               </w:rPr>
-              <w:t>/BCIT615.Assessment1.GamePlayer.App</w:t>
-            </w:r>
-          </w:p>
-        </w:tc>
-      </w:tr>
-      <w:tr>
-        <w:tc>
-          <w:tcPr>
-            <w:tcW w:w="2122" w:type="dxa"/>
-          </w:tcPr>
-          <w:p>
-            <w:r>
-              <w:t>Build result</w:t>
-            </w:r>
-          </w:p>
-        </w:tc>
-        <w:tc>
-          <w:tcPr>
-            <w:tcW w:w="6894" w:type="dxa"/>
-          </w:tcPr>
+              <w:t>BCIT615.Assessment1.GamePlayer.Contracts succeeded (4.2s) → src\BCIT615.Assessment1.GamePlayer.Contracts\bin\Debug\net9.0\BCIT615.Assessment1.GamePlayer.Contracts.dll</w:t>
+            </w:r>
+          </w:p>
           <w:p>
             <w:pPr>
               <w:rPr>
@@ -3950,7 +3598,7 @@
                 <w:sz w:val="16"/>
                 <w:szCs w:val="16"/>
               </w:rPr>
-              <w:t>BCIT615.Assessment1.GamePlayer.Contracts succeeded (4.2s) → src\BCIT615.Assessment1.GamePlayer.Contracts\bin\Debug\net9.0\BCIT615.Assessment1.GamePlayer.Contracts.dll</w:t>
+              <w:t xml:space="preserve">  BCIT615.Assessment1.GamePlayer.Model succeeded (3.1s) → src\BCIT615.Assessment1.GamePlayer.Model\bin\Debug\net9.0\BCIT615.Assessment1.GamePlayer.Model.dll</w:t>
             </w:r>
           </w:p>
           <w:p>
@@ -3965,7 +3613,7 @@
                 <w:sz w:val="16"/>
                 <w:szCs w:val="16"/>
               </w:rPr>
-              <w:t xml:space="preserve">  BCIT615.Assessment1.GamePlayer.Model succeeded (3.1s) → src\BCIT615.Assessment1.GamePlayer.Model\bin\Debug\net9.0\BCIT615.Assessment1.GamePlayer.Model.dll</w:t>
+              <w:t xml:space="preserve">  BCIT615.Assessment1.GamePlayer.ContractTests succeeded (1.0s) → tests\BCIT615.Assessment1.GamePlayer.ContractTests\bin\Debug\net9.0\BCIT615.Assessment1.GamePlayer.ContractTests.dll</w:t>
             </w:r>
           </w:p>
           <w:p>
@@ -3980,7 +3628,7 @@
                 <w:sz w:val="16"/>
                 <w:szCs w:val="16"/>
               </w:rPr>
-              <w:t xml:space="preserve">  BCIT615.Assessment1.GamePlayer.ContractTests succeeded (1.0s) → tests\BCIT615.Assessment1.GamePlayer.ContractTests\bin\Debug\net9.0\BCIT615.Assessment1.GamePlayer.ContractTests.dll</w:t>
+              <w:t xml:space="preserve">  BCIT615.Assessment1.GamePlayer.App succeeded (1.0s) → src\BCIT615.Assessment1.GamePlayer.App\bin\Debug\net9.0\BCIT615.Assessment1.GamePlayer.App.dll</w:t>
             </w:r>
           </w:p>
           <w:p>
@@ -3995,7 +3643,7 @@
                 <w:sz w:val="16"/>
                 <w:szCs w:val="16"/>
               </w:rPr>
-              <w:t xml:space="preserve">  BCIT615.Assessment1.GamePlayer.App succeeded (1.0s) → src\BCIT615.Assessment1.GamePlayer.App\bin\Debug\net9.0\BCIT615.Assessment1.GamePlayer.App.dll</w:t>
+              <w:t xml:space="preserve">  BCIT615.Assessment1.GamePlayer.ModelTests succeeded (1.0s) → tests\BCIT615.Assessment1.GamePlayer.ModelTests\bin\Debug\net9.0\BCIT615.Assessment1.GamePlayer.ModelTests.dll</w:t>
             </w:r>
           </w:p>
           <w:p>
@@ -4005,34 +3653,19 @@
                 <w:szCs w:val="16"/>
               </w:rPr>
             </w:pPr>
-            <w:r>
+          </w:p>
+          <w:p>
+            <w:pPr>
               <w:rPr>
                 <w:sz w:val="16"/>
                 <w:szCs w:val="16"/>
               </w:rPr>
-              <w:t xml:space="preserve">  BCIT615.Assessment1.GamePlayer.ModelTests succeeded (1.0s) → tests\BCIT615.Assessment1.GamePlayer.ModelTests\bin\Debug\net9.0\BCIT615.Assessment1.GamePlayer.ModelTests.dll</w:t>
-            </w:r>
-          </w:p>
-          <w:p>
-            <w:pPr>
+            </w:pPr>
+            <w:r>
               <w:rPr>
                 <w:sz w:val="16"/>
                 <w:szCs w:val="16"/>
               </w:rPr>
-            </w:pPr>
-          </w:p>
-          <w:p>
-            <w:pPr>
-              <w:rPr>
-                <w:sz w:val="16"/>
-                <w:szCs w:val="16"/>
-              </w:rPr>
-            </w:pPr>
-            <w:r>
-              <w:rPr>
-                <w:sz w:val="16"/>
-                <w:szCs w:val="16"/>
-              </w:rPr>
               <w:t>Build succeeded in 9.0s</w:t>
             </w:r>
           </w:p>
@@ -4142,15 +3775,7 @@
           </w:p>
           <w:p>
             <w:r>
-              <w:t xml:space="preserve">Implement </w:t>
-            </w:r>
-            <w:proofErr w:type="spellStart"/>
-            <w:r>
-              <w:t>IGamePlayer</w:t>
-            </w:r>
-            <w:proofErr w:type="spellEnd"/>
-            <w:r>
-              <w:t xml:space="preserve"> in learner-owned Model files.</w:t>
+              <w:t>Implement IGamePlayer in learner-owned Model files.</w:t>
             </w:r>
           </w:p>
         </w:tc>
@@ -4203,6 +3828,7 @@
         </w:rPr>
       </w:pPr>
       <w:r>
+        <w:lastRenderedPageBreak/>
         <w:br w:type="page"/>
       </w:r>
     </w:p>
@@ -4263,27 +3889,14 @@
       <w:r>
         <w:t xml:space="preserve">Figure </w:t>
       </w:r>
-      <w:r>
-        <w:fldChar w:fldCharType="begin"/>
-      </w:r>
-      <w:r>
-        <w:instrText xml:space="preserve"> SEQ Figure \* ARABIC </w:instrText>
-      </w:r>
-      <w:r>
-        <w:fldChar w:fldCharType="separate"/>
-      </w:r>
-      <w:r>
-        <w:rPr>
-          <w:noProof/>
-        </w:rPr>
-        <w:t>1</w:t>
-      </w:r>
-      <w:r>
-        <w:rPr>
-          <w:noProof/>
-        </w:rPr>
-        <w:fldChar w:fldCharType="end"/>
-      </w:r>
+      <w:fldSimple w:instr=" SEQ Figure \* ARABIC ">
+        <w:r>
+          <w:rPr>
+            <w:noProof/>
+          </w:rPr>
+          <w:t>1</w:t>
+        </w:r>
+      </w:fldSimple>
       <w:r>
         <w:t xml:space="preserve"> Screenshot of GitHub version history, more details such as </w:t>
       </w:r>
@@ -4963,6 +4576,7 @@
   <w:style w:type="character" w:default="1" w:styleId="DefaultParagraphFont">
     <w:name w:val="Default Paragraph Font"/>
     <w:uiPriority w:val="1"/>
+    <w:semiHidden/>
     <w:unhideWhenUsed/>
   </w:style>
   <w:style w:type="table" w:default="1" w:styleId="TableNormal">

</xml_diff>